<commit_message>
added logo feature on top of page
</commit_message>
<xml_diff>
--- a/detailed_analysis_report.docx
+++ b/detailed_analysis_report.docx
@@ -2,6 +2,42 @@
 <file path=word/document.xml><?xml version="1.0" encoding="utf-8"?>
 <w:document xmlns:wpc="http://schemas.microsoft.com/office/word/2010/wordprocessingCanvas" xmlns:mo="http://schemas.microsoft.com/office/mac/office/2008/main" xmlns:mc="http://schemas.openxmlformats.org/markup-compatibility/2006" xmlns:mv="urn:schemas-microsoft-com:mac:vml" xmlns:o="urn:schemas-microsoft-com:office:office" xmlns:r="http://schemas.openxmlformats.org/officeDocument/2006/relationships" xmlns:m="http://schemas.openxmlformats.org/officeDocument/2006/math" xmlns:v="urn:schemas-microsoft-com:vml" xmlns:wp14="http://schemas.microsoft.com/office/word/2010/wordprocessingDrawing" xmlns:wp="http://schemas.openxmlformats.org/drawingml/2006/wordprocessingDrawing" xmlns:w10="urn:schemas-microsoft-com:office:word" xmlns:w="http://schemas.openxmlformats.org/wordprocessingml/2006/main" xmlns:w14="http://schemas.microsoft.com/office/word/2010/wordml" xmlns:wpg="http://schemas.microsoft.com/office/word/2010/wordprocessingGroup" xmlns:wpi="http://schemas.microsoft.com/office/word/2010/wordprocessingInk" xmlns:wne="http://schemas.microsoft.com/office/word/2006/wordml" xmlns:wps="http://schemas.microsoft.com/office/word/2010/wordprocessingShape" mc:Ignorable="w14 wp14">
   <w:body>
+    <w:p>
+      <w:r>
+        <w:drawing>
+          <wp:inline xmlns:a="http://schemas.openxmlformats.org/drawingml/2006/main" xmlns:pic="http://schemas.openxmlformats.org/drawingml/2006/picture">
+            <wp:extent cx="1181100" cy="1238250"/>
+            <wp:docPr id="1" name="Picture 1"/>
+            <wp:cNvGraphicFramePr>
+              <a:graphicFrameLocks noChangeAspect="1"/>
+            </wp:cNvGraphicFramePr>
+            <a:graphic>
+              <a:graphicData uri="http://schemas.openxmlformats.org/drawingml/2006/picture">
+                <pic:pic>
+                  <pic:nvPicPr>
+                    <pic:cNvPr id="0" name="logo.png"/>
+                    <pic:cNvPicPr/>
+                  </pic:nvPicPr>
+                  <pic:blipFill>
+                    <a:blip r:embed="rId9"/>
+                    <a:stretch>
+                      <a:fillRect/>
+                    </a:stretch>
+                  </pic:blipFill>
+                  <pic:spPr>
+                    <a:xfrm>
+                      <a:off x="0" y="0"/>
+                      <a:ext cx="1181100" cy="1238250"/>
+                    </a:xfrm>
+                    <a:prstGeom prst="rect"/>
+                  </pic:spPr>
+                </pic:pic>
+              </a:graphicData>
+            </a:graphic>
+          </wp:inline>
+        </w:drawing>
+      </w:r>
+    </w:p>
     <w:p>
       <w:pPr>
         <w:pStyle w:val="Title"/>

</xml_diff>

<commit_message>
capture number added , date, time merged
</commit_message>
<xml_diff>
--- a/detailed_analysis_report.docx
+++ b/detailed_analysis_report.docx
@@ -83,18 +83,15 @@
         <w:tblLook w:firstColumn="1" w:firstRow="1" w:lastColumn="0" w:lastRow="0" w:noHBand="0" w:noVBand="1" w:val="04A0"/>
       </w:tblPr>
       <w:tblGrid>
-        <w:gridCol w:w="1234"/>
-        <w:gridCol w:w="1234"/>
-        <w:gridCol w:w="1234"/>
-        <w:gridCol w:w="1234"/>
-        <w:gridCol w:w="1234"/>
-        <w:gridCol w:w="1234"/>
-        <w:gridCol w:w="1234"/>
+        <w:gridCol w:w="2880"/>
+        <w:gridCol w:w="2880"/>
+        <w:gridCol w:w="2880"/>
       </w:tblGrid>
       <w:tr>
         <w:tc>
           <w:tcPr>
-            <w:tcW w:type="dxa" w:w="1234"/>
+            <w:tcW w:type="dxa" w:w="2880"/>
+            <w:shd w:fill="ffd700"/>
             <w:tcBorders>
               <w:top w:val="single" w:sz="4" w:space="0" w:color="auto"/>
               <w:left w:val="single" w:sz="4" w:space="0" w:color="auto"/>
@@ -108,13 +105,14 @@
                 <w:b/>
                 <w:sz w:val="24"/>
               </w:rPr>
-              <w:t>Month</w:t>
+              <w:t>Capture</w:t>
             </w:r>
           </w:p>
         </w:tc>
         <w:tc>
           <w:tcPr>
-            <w:tcW w:type="dxa" w:w="1234"/>
+            <w:tcW w:type="dxa" w:w="2880"/>
+            <w:shd w:fill="ffd700"/>
             <w:tcBorders>
               <w:top w:val="single" w:sz="4" w:space="0" w:color="auto"/>
               <w:left w:val="single" w:sz="4" w:space="0" w:color="auto"/>
@@ -128,13 +126,14 @@
                 <w:b/>
                 <w:sz w:val="24"/>
               </w:rPr>
-              <w:t>Day</w:t>
+              <w:t>Date</w:t>
             </w:r>
           </w:p>
         </w:tc>
         <w:tc>
           <w:tcPr>
-            <w:tcW w:type="dxa" w:w="1234"/>
+            <w:tcW w:type="dxa" w:w="2880"/>
+            <w:shd w:fill="ffd700"/>
             <w:tcBorders>
               <w:top w:val="single" w:sz="4" w:space="0" w:color="auto"/>
               <w:left w:val="single" w:sz="4" w:space="0" w:color="auto"/>
@@ -148,13 +147,15 @@
                 <w:b/>
                 <w:sz w:val="24"/>
               </w:rPr>
-              <w:t>Year</w:t>
+              <w:t>Time</w:t>
             </w:r>
           </w:p>
         </w:tc>
+      </w:tr>
+      <w:tr>
         <w:tc>
           <w:tcPr>
-            <w:tcW w:type="dxa" w:w="1234"/>
+            <w:tcW w:type="dxa" w:w="2880"/>
             <w:tcBorders>
               <w:top w:val="single" w:sz="4" w:space="0" w:color="auto"/>
               <w:left w:val="single" w:sz="4" w:space="0" w:color="auto"/>
@@ -164,17 +165,13 @@
           </w:tcPr>
           <w:p>
             <w:r>
-              <w:rPr>
-                <w:b/>
-                <w:sz w:val="24"/>
-              </w:rPr>
-              <w:t>Hour</w:t>
+              <w:t>1</w:t>
             </w:r>
           </w:p>
         </w:tc>
         <w:tc>
           <w:tcPr>
-            <w:tcW w:type="dxa" w:w="1234"/>
+            <w:tcW w:type="dxa" w:w="2880"/>
             <w:tcBorders>
               <w:top w:val="single" w:sz="4" w:space="0" w:color="auto"/>
               <w:left w:val="single" w:sz="4" w:space="0" w:color="auto"/>
@@ -184,17 +181,13 @@
           </w:tcPr>
           <w:p>
             <w:r>
-              <w:rPr>
-                <w:b/>
-                <w:sz w:val="24"/>
-              </w:rPr>
-              <w:t>Minute</w:t>
+              <w:t>January 22, 2023</w:t>
             </w:r>
           </w:p>
         </w:tc>
         <w:tc>
           <w:tcPr>
-            <w:tcW w:type="dxa" w:w="1234"/>
+            <w:tcW w:type="dxa" w:w="2880"/>
             <w:tcBorders>
               <w:top w:val="single" w:sz="4" w:space="0" w:color="auto"/>
               <w:left w:val="single" w:sz="4" w:space="0" w:color="auto"/>
@@ -204,17 +197,15 @@
           </w:tcPr>
           <w:p>
             <w:r>
-              <w:rPr>
-                <w:b/>
-                <w:sz w:val="24"/>
-              </w:rPr>
-              <w:t>Second</w:t>
+              <w:t>05:56:39 PM</w:t>
             </w:r>
           </w:p>
         </w:tc>
+      </w:tr>
+      <w:tr>
         <w:tc>
           <w:tcPr>
-            <w:tcW w:type="dxa" w:w="1234"/>
+            <w:tcW w:type="dxa" w:w="2880"/>
             <w:tcBorders>
               <w:top w:val="single" w:sz="4" w:space="0" w:color="auto"/>
               <w:left w:val="single" w:sz="4" w:space="0" w:color="auto"/>
@@ -224,19 +215,13 @@
           </w:tcPr>
           <w:p>
             <w:r>
-              <w:rPr>
-                <w:b/>
-                <w:sz w:val="24"/>
-              </w:rPr>
-              <w:t>AM/PM</w:t>
+              <w:t>2</w:t>
             </w:r>
           </w:p>
         </w:tc>
-      </w:tr>
-      <w:tr>
         <w:tc>
           <w:tcPr>
-            <w:tcW w:type="dxa" w:w="1234"/>
+            <w:tcW w:type="dxa" w:w="2880"/>
             <w:tcBorders>
               <w:top w:val="single" w:sz="4" w:space="0" w:color="auto"/>
               <w:left w:val="single" w:sz="4" w:space="0" w:color="auto"/>
@@ -246,13 +231,981 @@
           </w:tcPr>
           <w:p>
             <w:r>
-              <w:t>January</w:t>
+              <w:t>March 18, 2023</w:t>
             </w:r>
           </w:p>
         </w:tc>
         <w:tc>
           <w:tcPr>
-            <w:tcW w:type="dxa" w:w="1234"/>
+            <w:tcW w:type="dxa" w:w="2880"/>
+            <w:tcBorders>
+              <w:top w:val="single" w:sz="4" w:space="0" w:color="auto"/>
+              <w:left w:val="single" w:sz="4" w:space="0" w:color="auto"/>
+              <w:bottom w:val="single" w:sz="4" w:space="0" w:color="auto"/>
+              <w:right w:val="single" w:sz="4" w:space="0" w:color="auto"/>
+            </w:tcBorders>
+          </w:tcPr>
+          <w:p>
+            <w:r>
+              <w:t>09:06:01 AM</w:t>
+            </w:r>
+          </w:p>
+        </w:tc>
+      </w:tr>
+      <w:tr>
+        <w:tc>
+          <w:tcPr>
+            <w:tcW w:type="dxa" w:w="2880"/>
+            <w:tcBorders>
+              <w:top w:val="single" w:sz="4" w:space="0" w:color="auto"/>
+              <w:left w:val="single" w:sz="4" w:space="0" w:color="auto"/>
+              <w:bottom w:val="single" w:sz="4" w:space="0" w:color="auto"/>
+              <w:right w:val="single" w:sz="4" w:space="0" w:color="auto"/>
+            </w:tcBorders>
+          </w:tcPr>
+          <w:p>
+            <w:r>
+              <w:t>3</w:t>
+            </w:r>
+          </w:p>
+        </w:tc>
+        <w:tc>
+          <w:tcPr>
+            <w:tcW w:type="dxa" w:w="2880"/>
+            <w:tcBorders>
+              <w:top w:val="single" w:sz="4" w:space="0" w:color="auto"/>
+              <w:left w:val="single" w:sz="4" w:space="0" w:color="auto"/>
+              <w:bottom w:val="single" w:sz="4" w:space="0" w:color="auto"/>
+              <w:right w:val="single" w:sz="4" w:space="0" w:color="auto"/>
+            </w:tcBorders>
+          </w:tcPr>
+          <w:p>
+            <w:r>
+              <w:t>March 18, 2023</w:t>
+            </w:r>
+          </w:p>
+        </w:tc>
+        <w:tc>
+          <w:tcPr>
+            <w:tcW w:type="dxa" w:w="2880"/>
+            <w:tcBorders>
+              <w:top w:val="single" w:sz="4" w:space="0" w:color="auto"/>
+              <w:left w:val="single" w:sz="4" w:space="0" w:color="auto"/>
+              <w:bottom w:val="single" w:sz="4" w:space="0" w:color="auto"/>
+              <w:right w:val="single" w:sz="4" w:space="0" w:color="auto"/>
+            </w:tcBorders>
+          </w:tcPr>
+          <w:p>
+            <w:r>
+              <w:t>09:06:03 AM</w:t>
+            </w:r>
+          </w:p>
+        </w:tc>
+      </w:tr>
+      <w:tr>
+        <w:tc>
+          <w:tcPr>
+            <w:tcW w:type="dxa" w:w="2880"/>
+            <w:tcBorders>
+              <w:top w:val="single" w:sz="4" w:space="0" w:color="auto"/>
+              <w:left w:val="single" w:sz="4" w:space="0" w:color="auto"/>
+              <w:bottom w:val="single" w:sz="4" w:space="0" w:color="auto"/>
+              <w:right w:val="single" w:sz="4" w:space="0" w:color="auto"/>
+            </w:tcBorders>
+          </w:tcPr>
+          <w:p>
+            <w:r>
+              <w:t>4</w:t>
+            </w:r>
+          </w:p>
+        </w:tc>
+        <w:tc>
+          <w:tcPr>
+            <w:tcW w:type="dxa" w:w="2880"/>
+            <w:tcBorders>
+              <w:top w:val="single" w:sz="4" w:space="0" w:color="auto"/>
+              <w:left w:val="single" w:sz="4" w:space="0" w:color="auto"/>
+              <w:bottom w:val="single" w:sz="4" w:space="0" w:color="auto"/>
+              <w:right w:val="single" w:sz="4" w:space="0" w:color="auto"/>
+            </w:tcBorders>
+          </w:tcPr>
+          <w:p>
+            <w:r>
+              <w:t>March 21, 2023</w:t>
+            </w:r>
+          </w:p>
+        </w:tc>
+        <w:tc>
+          <w:tcPr>
+            <w:tcW w:type="dxa" w:w="2880"/>
+            <w:tcBorders>
+              <w:top w:val="single" w:sz="4" w:space="0" w:color="auto"/>
+              <w:left w:val="single" w:sz="4" w:space="0" w:color="auto"/>
+              <w:bottom w:val="single" w:sz="4" w:space="0" w:color="auto"/>
+              <w:right w:val="single" w:sz="4" w:space="0" w:color="auto"/>
+            </w:tcBorders>
+          </w:tcPr>
+          <w:p>
+            <w:r>
+              <w:t>07:52:43 PM</w:t>
+            </w:r>
+          </w:p>
+        </w:tc>
+      </w:tr>
+      <w:tr>
+        <w:tc>
+          <w:tcPr>
+            <w:tcW w:type="dxa" w:w="2880"/>
+            <w:tcBorders>
+              <w:top w:val="single" w:sz="4" w:space="0" w:color="auto"/>
+              <w:left w:val="single" w:sz="4" w:space="0" w:color="auto"/>
+              <w:bottom w:val="single" w:sz="4" w:space="0" w:color="auto"/>
+              <w:right w:val="single" w:sz="4" w:space="0" w:color="auto"/>
+            </w:tcBorders>
+          </w:tcPr>
+          <w:p>
+            <w:r>
+              <w:t>5</w:t>
+            </w:r>
+          </w:p>
+        </w:tc>
+        <w:tc>
+          <w:tcPr>
+            <w:tcW w:type="dxa" w:w="2880"/>
+            <w:tcBorders>
+              <w:top w:val="single" w:sz="4" w:space="0" w:color="auto"/>
+              <w:left w:val="single" w:sz="4" w:space="0" w:color="auto"/>
+              <w:bottom w:val="single" w:sz="4" w:space="0" w:color="auto"/>
+              <w:right w:val="single" w:sz="4" w:space="0" w:color="auto"/>
+            </w:tcBorders>
+          </w:tcPr>
+          <w:p>
+            <w:r>
+              <w:t>March 22, 2023</w:t>
+            </w:r>
+          </w:p>
+        </w:tc>
+        <w:tc>
+          <w:tcPr>
+            <w:tcW w:type="dxa" w:w="2880"/>
+            <w:tcBorders>
+              <w:top w:val="single" w:sz="4" w:space="0" w:color="auto"/>
+              <w:left w:val="single" w:sz="4" w:space="0" w:color="auto"/>
+              <w:bottom w:val="single" w:sz="4" w:space="0" w:color="auto"/>
+              <w:right w:val="single" w:sz="4" w:space="0" w:color="auto"/>
+            </w:tcBorders>
+          </w:tcPr>
+          <w:p>
+            <w:r>
+              <w:t>02:40:33 PM</w:t>
+            </w:r>
+          </w:p>
+        </w:tc>
+      </w:tr>
+      <w:tr>
+        <w:tc>
+          <w:tcPr>
+            <w:tcW w:type="dxa" w:w="2880"/>
+            <w:tcBorders>
+              <w:top w:val="single" w:sz="4" w:space="0" w:color="auto"/>
+              <w:left w:val="single" w:sz="4" w:space="0" w:color="auto"/>
+              <w:bottom w:val="single" w:sz="4" w:space="0" w:color="auto"/>
+              <w:right w:val="single" w:sz="4" w:space="0" w:color="auto"/>
+            </w:tcBorders>
+          </w:tcPr>
+          <w:p>
+            <w:r>
+              <w:t>6</w:t>
+            </w:r>
+          </w:p>
+        </w:tc>
+        <w:tc>
+          <w:tcPr>
+            <w:tcW w:type="dxa" w:w="2880"/>
+            <w:tcBorders>
+              <w:top w:val="single" w:sz="4" w:space="0" w:color="auto"/>
+              <w:left w:val="single" w:sz="4" w:space="0" w:color="auto"/>
+              <w:bottom w:val="single" w:sz="4" w:space="0" w:color="auto"/>
+              <w:right w:val="single" w:sz="4" w:space="0" w:color="auto"/>
+            </w:tcBorders>
+          </w:tcPr>
+          <w:p>
+            <w:r>
+              <w:t>March 30, 2023</w:t>
+            </w:r>
+          </w:p>
+        </w:tc>
+        <w:tc>
+          <w:tcPr>
+            <w:tcW w:type="dxa" w:w="2880"/>
+            <w:tcBorders>
+              <w:top w:val="single" w:sz="4" w:space="0" w:color="auto"/>
+              <w:left w:val="single" w:sz="4" w:space="0" w:color="auto"/>
+              <w:bottom w:val="single" w:sz="4" w:space="0" w:color="auto"/>
+              <w:right w:val="single" w:sz="4" w:space="0" w:color="auto"/>
+            </w:tcBorders>
+          </w:tcPr>
+          <w:p>
+            <w:r>
+              <w:t>02:50:53 AM</w:t>
+            </w:r>
+          </w:p>
+        </w:tc>
+      </w:tr>
+      <w:tr>
+        <w:tc>
+          <w:tcPr>
+            <w:tcW w:type="dxa" w:w="2880"/>
+            <w:tcBorders>
+              <w:top w:val="single" w:sz="4" w:space="0" w:color="auto"/>
+              <w:left w:val="single" w:sz="4" w:space="0" w:color="auto"/>
+              <w:bottom w:val="single" w:sz="4" w:space="0" w:color="auto"/>
+              <w:right w:val="single" w:sz="4" w:space="0" w:color="auto"/>
+            </w:tcBorders>
+          </w:tcPr>
+          <w:p>
+            <w:r>
+              <w:t>7</w:t>
+            </w:r>
+          </w:p>
+        </w:tc>
+        <w:tc>
+          <w:tcPr>
+            <w:tcW w:type="dxa" w:w="2880"/>
+            <w:tcBorders>
+              <w:top w:val="single" w:sz="4" w:space="0" w:color="auto"/>
+              <w:left w:val="single" w:sz="4" w:space="0" w:color="auto"/>
+              <w:bottom w:val="single" w:sz="4" w:space="0" w:color="auto"/>
+              <w:right w:val="single" w:sz="4" w:space="0" w:color="auto"/>
+            </w:tcBorders>
+          </w:tcPr>
+          <w:p>
+            <w:r>
+              <w:t>April 17, 2023</w:t>
+            </w:r>
+          </w:p>
+        </w:tc>
+        <w:tc>
+          <w:tcPr>
+            <w:tcW w:type="dxa" w:w="2880"/>
+            <w:tcBorders>
+              <w:top w:val="single" w:sz="4" w:space="0" w:color="auto"/>
+              <w:left w:val="single" w:sz="4" w:space="0" w:color="auto"/>
+              <w:bottom w:val="single" w:sz="4" w:space="0" w:color="auto"/>
+              <w:right w:val="single" w:sz="4" w:space="0" w:color="auto"/>
+            </w:tcBorders>
+          </w:tcPr>
+          <w:p>
+            <w:r>
+              <w:t>04:37:30 AM</w:t>
+            </w:r>
+          </w:p>
+        </w:tc>
+      </w:tr>
+      <w:tr>
+        <w:tc>
+          <w:tcPr>
+            <w:tcW w:type="dxa" w:w="2880"/>
+            <w:tcBorders>
+              <w:top w:val="single" w:sz="4" w:space="0" w:color="auto"/>
+              <w:left w:val="single" w:sz="4" w:space="0" w:color="auto"/>
+              <w:bottom w:val="single" w:sz="4" w:space="0" w:color="auto"/>
+              <w:right w:val="single" w:sz="4" w:space="0" w:color="auto"/>
+            </w:tcBorders>
+          </w:tcPr>
+          <w:p>
+            <w:r>
+              <w:t>8</w:t>
+            </w:r>
+          </w:p>
+        </w:tc>
+        <w:tc>
+          <w:tcPr>
+            <w:tcW w:type="dxa" w:w="2880"/>
+            <w:tcBorders>
+              <w:top w:val="single" w:sz="4" w:space="0" w:color="auto"/>
+              <w:left w:val="single" w:sz="4" w:space="0" w:color="auto"/>
+              <w:bottom w:val="single" w:sz="4" w:space="0" w:color="auto"/>
+              <w:right w:val="single" w:sz="4" w:space="0" w:color="auto"/>
+            </w:tcBorders>
+          </w:tcPr>
+          <w:p>
+            <w:r>
+              <w:t>April 17, 2023</w:t>
+            </w:r>
+          </w:p>
+        </w:tc>
+        <w:tc>
+          <w:tcPr>
+            <w:tcW w:type="dxa" w:w="2880"/>
+            <w:tcBorders>
+              <w:top w:val="single" w:sz="4" w:space="0" w:color="auto"/>
+              <w:left w:val="single" w:sz="4" w:space="0" w:color="auto"/>
+              <w:bottom w:val="single" w:sz="4" w:space="0" w:color="auto"/>
+              <w:right w:val="single" w:sz="4" w:space="0" w:color="auto"/>
+            </w:tcBorders>
+          </w:tcPr>
+          <w:p>
+            <w:r>
+              <w:t>04:37:31 AM</w:t>
+            </w:r>
+          </w:p>
+        </w:tc>
+      </w:tr>
+      <w:tr>
+        <w:tc>
+          <w:tcPr>
+            <w:tcW w:type="dxa" w:w="2880"/>
+            <w:tcBorders>
+              <w:top w:val="single" w:sz="4" w:space="0" w:color="auto"/>
+              <w:left w:val="single" w:sz="4" w:space="0" w:color="auto"/>
+              <w:bottom w:val="single" w:sz="4" w:space="0" w:color="auto"/>
+              <w:right w:val="single" w:sz="4" w:space="0" w:color="auto"/>
+            </w:tcBorders>
+          </w:tcPr>
+          <w:p>
+            <w:r>
+              <w:t>9</w:t>
+            </w:r>
+          </w:p>
+        </w:tc>
+        <w:tc>
+          <w:tcPr>
+            <w:tcW w:type="dxa" w:w="2880"/>
+            <w:tcBorders>
+              <w:top w:val="single" w:sz="4" w:space="0" w:color="auto"/>
+              <w:left w:val="single" w:sz="4" w:space="0" w:color="auto"/>
+              <w:bottom w:val="single" w:sz="4" w:space="0" w:color="auto"/>
+              <w:right w:val="single" w:sz="4" w:space="0" w:color="auto"/>
+            </w:tcBorders>
+          </w:tcPr>
+          <w:p>
+            <w:r>
+              <w:t>June 10, 2023</w:t>
+            </w:r>
+          </w:p>
+        </w:tc>
+        <w:tc>
+          <w:tcPr>
+            <w:tcW w:type="dxa" w:w="2880"/>
+            <w:tcBorders>
+              <w:top w:val="single" w:sz="4" w:space="0" w:color="auto"/>
+              <w:left w:val="single" w:sz="4" w:space="0" w:color="auto"/>
+              <w:bottom w:val="single" w:sz="4" w:space="0" w:color="auto"/>
+              <w:right w:val="single" w:sz="4" w:space="0" w:color="auto"/>
+            </w:tcBorders>
+          </w:tcPr>
+          <w:p>
+            <w:r>
+              <w:t>01:32:47 PM</w:t>
+            </w:r>
+          </w:p>
+        </w:tc>
+      </w:tr>
+      <w:tr>
+        <w:tc>
+          <w:tcPr>
+            <w:tcW w:type="dxa" w:w="2880"/>
+            <w:tcBorders>
+              <w:top w:val="single" w:sz="4" w:space="0" w:color="auto"/>
+              <w:left w:val="single" w:sz="4" w:space="0" w:color="auto"/>
+              <w:bottom w:val="single" w:sz="4" w:space="0" w:color="auto"/>
+              <w:right w:val="single" w:sz="4" w:space="0" w:color="auto"/>
+            </w:tcBorders>
+          </w:tcPr>
+          <w:p>
+            <w:r>
+              <w:t>10</w:t>
+            </w:r>
+          </w:p>
+        </w:tc>
+        <w:tc>
+          <w:tcPr>
+            <w:tcW w:type="dxa" w:w="2880"/>
+            <w:tcBorders>
+              <w:top w:val="single" w:sz="4" w:space="0" w:color="auto"/>
+              <w:left w:val="single" w:sz="4" w:space="0" w:color="auto"/>
+              <w:bottom w:val="single" w:sz="4" w:space="0" w:color="auto"/>
+              <w:right w:val="single" w:sz="4" w:space="0" w:color="auto"/>
+            </w:tcBorders>
+          </w:tcPr>
+          <w:p>
+            <w:r>
+              <w:t>July 04, 2023</w:t>
+            </w:r>
+          </w:p>
+        </w:tc>
+        <w:tc>
+          <w:tcPr>
+            <w:tcW w:type="dxa" w:w="2880"/>
+            <w:tcBorders>
+              <w:top w:val="single" w:sz="4" w:space="0" w:color="auto"/>
+              <w:left w:val="single" w:sz="4" w:space="0" w:color="auto"/>
+              <w:bottom w:val="single" w:sz="4" w:space="0" w:color="auto"/>
+              <w:right w:val="single" w:sz="4" w:space="0" w:color="auto"/>
+            </w:tcBorders>
+          </w:tcPr>
+          <w:p>
+            <w:r>
+              <w:t>05:41:18 PM</w:t>
+            </w:r>
+          </w:p>
+        </w:tc>
+      </w:tr>
+      <w:tr>
+        <w:tc>
+          <w:tcPr>
+            <w:tcW w:type="dxa" w:w="2880"/>
+            <w:tcBorders>
+              <w:top w:val="single" w:sz="4" w:space="0" w:color="auto"/>
+              <w:left w:val="single" w:sz="4" w:space="0" w:color="auto"/>
+              <w:bottom w:val="single" w:sz="4" w:space="0" w:color="auto"/>
+              <w:right w:val="single" w:sz="4" w:space="0" w:color="auto"/>
+            </w:tcBorders>
+          </w:tcPr>
+          <w:p>
+            <w:r>
+              <w:t>11</w:t>
+            </w:r>
+          </w:p>
+        </w:tc>
+        <w:tc>
+          <w:tcPr>
+            <w:tcW w:type="dxa" w:w="2880"/>
+            <w:tcBorders>
+              <w:top w:val="single" w:sz="4" w:space="0" w:color="auto"/>
+              <w:left w:val="single" w:sz="4" w:space="0" w:color="auto"/>
+              <w:bottom w:val="single" w:sz="4" w:space="0" w:color="auto"/>
+              <w:right w:val="single" w:sz="4" w:space="0" w:color="auto"/>
+            </w:tcBorders>
+          </w:tcPr>
+          <w:p>
+            <w:r>
+              <w:t>July 04, 2023</w:t>
+            </w:r>
+          </w:p>
+        </w:tc>
+        <w:tc>
+          <w:tcPr>
+            <w:tcW w:type="dxa" w:w="2880"/>
+            <w:tcBorders>
+              <w:top w:val="single" w:sz="4" w:space="0" w:color="auto"/>
+              <w:left w:val="single" w:sz="4" w:space="0" w:color="auto"/>
+              <w:bottom w:val="single" w:sz="4" w:space="0" w:color="auto"/>
+              <w:right w:val="single" w:sz="4" w:space="0" w:color="auto"/>
+            </w:tcBorders>
+          </w:tcPr>
+          <w:p>
+            <w:r>
+              <w:t>05:41:20 PM</w:t>
+            </w:r>
+          </w:p>
+        </w:tc>
+      </w:tr>
+      <w:tr>
+        <w:tc>
+          <w:tcPr>
+            <w:tcW w:type="dxa" w:w="2880"/>
+            <w:tcBorders>
+              <w:top w:val="single" w:sz="4" w:space="0" w:color="auto"/>
+              <w:left w:val="single" w:sz="4" w:space="0" w:color="auto"/>
+              <w:bottom w:val="single" w:sz="4" w:space="0" w:color="auto"/>
+              <w:right w:val="single" w:sz="4" w:space="0" w:color="auto"/>
+            </w:tcBorders>
+          </w:tcPr>
+          <w:p>
+            <w:r>
+              <w:t>12</w:t>
+            </w:r>
+          </w:p>
+        </w:tc>
+        <w:tc>
+          <w:tcPr>
+            <w:tcW w:type="dxa" w:w="2880"/>
+            <w:tcBorders>
+              <w:top w:val="single" w:sz="4" w:space="0" w:color="auto"/>
+              <w:left w:val="single" w:sz="4" w:space="0" w:color="auto"/>
+              <w:bottom w:val="single" w:sz="4" w:space="0" w:color="auto"/>
+              <w:right w:val="single" w:sz="4" w:space="0" w:color="auto"/>
+            </w:tcBorders>
+          </w:tcPr>
+          <w:p>
+            <w:r>
+              <w:t>September 02, 2023</w:t>
+            </w:r>
+          </w:p>
+        </w:tc>
+        <w:tc>
+          <w:tcPr>
+            <w:tcW w:type="dxa" w:w="2880"/>
+            <w:tcBorders>
+              <w:top w:val="single" w:sz="4" w:space="0" w:color="auto"/>
+              <w:left w:val="single" w:sz="4" w:space="0" w:color="auto"/>
+              <w:bottom w:val="single" w:sz="4" w:space="0" w:color="auto"/>
+              <w:right w:val="single" w:sz="4" w:space="0" w:color="auto"/>
+            </w:tcBorders>
+          </w:tcPr>
+          <w:p>
+            <w:r>
+              <w:t>09:25:16 PM</w:t>
+            </w:r>
+          </w:p>
+        </w:tc>
+      </w:tr>
+      <w:tr>
+        <w:tc>
+          <w:tcPr>
+            <w:tcW w:type="dxa" w:w="2880"/>
+            <w:tcBorders>
+              <w:top w:val="single" w:sz="4" w:space="0" w:color="auto"/>
+              <w:left w:val="single" w:sz="4" w:space="0" w:color="auto"/>
+              <w:bottom w:val="single" w:sz="4" w:space="0" w:color="auto"/>
+              <w:right w:val="single" w:sz="4" w:space="0" w:color="auto"/>
+            </w:tcBorders>
+          </w:tcPr>
+          <w:p>
+            <w:r>
+              <w:t>13</w:t>
+            </w:r>
+          </w:p>
+        </w:tc>
+        <w:tc>
+          <w:tcPr>
+            <w:tcW w:type="dxa" w:w="2880"/>
+            <w:tcBorders>
+              <w:top w:val="single" w:sz="4" w:space="0" w:color="auto"/>
+              <w:left w:val="single" w:sz="4" w:space="0" w:color="auto"/>
+              <w:bottom w:val="single" w:sz="4" w:space="0" w:color="auto"/>
+              <w:right w:val="single" w:sz="4" w:space="0" w:color="auto"/>
+            </w:tcBorders>
+          </w:tcPr>
+          <w:p>
+            <w:r>
+              <w:t>September 02, 2023</w:t>
+            </w:r>
+          </w:p>
+        </w:tc>
+        <w:tc>
+          <w:tcPr>
+            <w:tcW w:type="dxa" w:w="2880"/>
+            <w:tcBorders>
+              <w:top w:val="single" w:sz="4" w:space="0" w:color="auto"/>
+              <w:left w:val="single" w:sz="4" w:space="0" w:color="auto"/>
+              <w:bottom w:val="single" w:sz="4" w:space="0" w:color="auto"/>
+              <w:right w:val="single" w:sz="4" w:space="0" w:color="auto"/>
+            </w:tcBorders>
+          </w:tcPr>
+          <w:p>
+            <w:r>
+              <w:t>09:25:17 PM</w:t>
+            </w:r>
+          </w:p>
+        </w:tc>
+      </w:tr>
+      <w:tr>
+        <w:tc>
+          <w:tcPr>
+            <w:tcW w:type="dxa" w:w="2880"/>
+            <w:tcBorders>
+              <w:top w:val="single" w:sz="4" w:space="0" w:color="auto"/>
+              <w:left w:val="single" w:sz="4" w:space="0" w:color="auto"/>
+              <w:bottom w:val="single" w:sz="4" w:space="0" w:color="auto"/>
+              <w:right w:val="single" w:sz="4" w:space="0" w:color="auto"/>
+            </w:tcBorders>
+          </w:tcPr>
+          <w:p>
+            <w:r>
+              <w:t>14</w:t>
+            </w:r>
+          </w:p>
+        </w:tc>
+        <w:tc>
+          <w:tcPr>
+            <w:tcW w:type="dxa" w:w="2880"/>
+            <w:tcBorders>
+              <w:top w:val="single" w:sz="4" w:space="0" w:color="auto"/>
+              <w:left w:val="single" w:sz="4" w:space="0" w:color="auto"/>
+              <w:bottom w:val="single" w:sz="4" w:space="0" w:color="auto"/>
+              <w:right w:val="single" w:sz="4" w:space="0" w:color="auto"/>
+            </w:tcBorders>
+          </w:tcPr>
+          <w:p>
+            <w:r>
+              <w:t>September 29, 2023</w:t>
+            </w:r>
+          </w:p>
+        </w:tc>
+        <w:tc>
+          <w:tcPr>
+            <w:tcW w:type="dxa" w:w="2880"/>
+            <w:tcBorders>
+              <w:top w:val="single" w:sz="4" w:space="0" w:color="auto"/>
+              <w:left w:val="single" w:sz="4" w:space="0" w:color="auto"/>
+              <w:bottom w:val="single" w:sz="4" w:space="0" w:color="auto"/>
+              <w:right w:val="single" w:sz="4" w:space="0" w:color="auto"/>
+            </w:tcBorders>
+          </w:tcPr>
+          <w:p>
+            <w:r>
+              <w:t>04:03:46 PM</w:t>
+            </w:r>
+          </w:p>
+        </w:tc>
+      </w:tr>
+      <w:tr>
+        <w:tc>
+          <w:tcPr>
+            <w:tcW w:type="dxa" w:w="2880"/>
+            <w:tcBorders>
+              <w:top w:val="single" w:sz="4" w:space="0" w:color="auto"/>
+              <w:left w:val="single" w:sz="4" w:space="0" w:color="auto"/>
+              <w:bottom w:val="single" w:sz="4" w:space="0" w:color="auto"/>
+              <w:right w:val="single" w:sz="4" w:space="0" w:color="auto"/>
+            </w:tcBorders>
+          </w:tcPr>
+          <w:p>
+            <w:r>
+              <w:t>15</w:t>
+            </w:r>
+          </w:p>
+        </w:tc>
+        <w:tc>
+          <w:tcPr>
+            <w:tcW w:type="dxa" w:w="2880"/>
+            <w:tcBorders>
+              <w:top w:val="single" w:sz="4" w:space="0" w:color="auto"/>
+              <w:left w:val="single" w:sz="4" w:space="0" w:color="auto"/>
+              <w:bottom w:val="single" w:sz="4" w:space="0" w:color="auto"/>
+              <w:right w:val="single" w:sz="4" w:space="0" w:color="auto"/>
+            </w:tcBorders>
+          </w:tcPr>
+          <w:p>
+            <w:r>
+              <w:t>November 11, 2023</w:t>
+            </w:r>
+          </w:p>
+        </w:tc>
+        <w:tc>
+          <w:tcPr>
+            <w:tcW w:type="dxa" w:w="2880"/>
+            <w:tcBorders>
+              <w:top w:val="single" w:sz="4" w:space="0" w:color="auto"/>
+              <w:left w:val="single" w:sz="4" w:space="0" w:color="auto"/>
+              <w:bottom w:val="single" w:sz="4" w:space="0" w:color="auto"/>
+              <w:right w:val="single" w:sz="4" w:space="0" w:color="auto"/>
+            </w:tcBorders>
+          </w:tcPr>
+          <w:p>
+            <w:r>
+              <w:t>03:26:16 AM</w:t>
+            </w:r>
+          </w:p>
+        </w:tc>
+      </w:tr>
+      <w:tr>
+        <w:tc>
+          <w:tcPr>
+            <w:tcW w:type="dxa" w:w="2880"/>
+            <w:tcBorders>
+              <w:top w:val="single" w:sz="4" w:space="0" w:color="auto"/>
+              <w:left w:val="single" w:sz="4" w:space="0" w:color="auto"/>
+              <w:bottom w:val="single" w:sz="4" w:space="0" w:color="auto"/>
+              <w:right w:val="single" w:sz="4" w:space="0" w:color="auto"/>
+            </w:tcBorders>
+          </w:tcPr>
+          <w:p>
+            <w:r>
+              <w:t>16</w:t>
+            </w:r>
+          </w:p>
+        </w:tc>
+        <w:tc>
+          <w:tcPr>
+            <w:tcW w:type="dxa" w:w="2880"/>
+            <w:tcBorders>
+              <w:top w:val="single" w:sz="4" w:space="0" w:color="auto"/>
+              <w:left w:val="single" w:sz="4" w:space="0" w:color="auto"/>
+              <w:bottom w:val="single" w:sz="4" w:space="0" w:color="auto"/>
+              <w:right w:val="single" w:sz="4" w:space="0" w:color="auto"/>
+            </w:tcBorders>
+          </w:tcPr>
+          <w:p>
+            <w:r>
+              <w:t>November 11, 2023</w:t>
+            </w:r>
+          </w:p>
+        </w:tc>
+        <w:tc>
+          <w:tcPr>
+            <w:tcW w:type="dxa" w:w="2880"/>
+            <w:tcBorders>
+              <w:top w:val="single" w:sz="4" w:space="0" w:color="auto"/>
+              <w:left w:val="single" w:sz="4" w:space="0" w:color="auto"/>
+              <w:bottom w:val="single" w:sz="4" w:space="0" w:color="auto"/>
+              <w:right w:val="single" w:sz="4" w:space="0" w:color="auto"/>
+            </w:tcBorders>
+          </w:tcPr>
+          <w:p>
+            <w:r>
+              <w:t>03:26:17 AM</w:t>
+            </w:r>
+          </w:p>
+        </w:tc>
+      </w:tr>
+      <w:tr>
+        <w:tc>
+          <w:tcPr>
+            <w:tcW w:type="dxa" w:w="2880"/>
+            <w:tcBorders>
+              <w:top w:val="single" w:sz="4" w:space="0" w:color="auto"/>
+              <w:left w:val="single" w:sz="4" w:space="0" w:color="auto"/>
+              <w:bottom w:val="single" w:sz="4" w:space="0" w:color="auto"/>
+              <w:right w:val="single" w:sz="4" w:space="0" w:color="auto"/>
+            </w:tcBorders>
+          </w:tcPr>
+          <w:p>
+            <w:r>
+              <w:t>17</w:t>
+            </w:r>
+          </w:p>
+        </w:tc>
+        <w:tc>
+          <w:tcPr>
+            <w:tcW w:type="dxa" w:w="2880"/>
+            <w:tcBorders>
+              <w:top w:val="single" w:sz="4" w:space="0" w:color="auto"/>
+              <w:left w:val="single" w:sz="4" w:space="0" w:color="auto"/>
+              <w:bottom w:val="single" w:sz="4" w:space="0" w:color="auto"/>
+              <w:right w:val="single" w:sz="4" w:space="0" w:color="auto"/>
+            </w:tcBorders>
+          </w:tcPr>
+          <w:p>
+            <w:r>
+              <w:t>December 08, 2023</w:t>
+            </w:r>
+          </w:p>
+        </w:tc>
+        <w:tc>
+          <w:tcPr>
+            <w:tcW w:type="dxa" w:w="2880"/>
+            <w:tcBorders>
+              <w:top w:val="single" w:sz="4" w:space="0" w:color="auto"/>
+              <w:left w:val="single" w:sz="4" w:space="0" w:color="auto"/>
+              <w:bottom w:val="single" w:sz="4" w:space="0" w:color="auto"/>
+              <w:right w:val="single" w:sz="4" w:space="0" w:color="auto"/>
+            </w:tcBorders>
+          </w:tcPr>
+          <w:p>
+            <w:r>
+              <w:t>06:23:16 AM</w:t>
+            </w:r>
+          </w:p>
+        </w:tc>
+      </w:tr>
+      <w:tr>
+        <w:tc>
+          <w:tcPr>
+            <w:tcW w:type="dxa" w:w="2880"/>
+            <w:tcBorders>
+              <w:top w:val="single" w:sz="4" w:space="0" w:color="auto"/>
+              <w:left w:val="single" w:sz="4" w:space="0" w:color="auto"/>
+              <w:bottom w:val="single" w:sz="4" w:space="0" w:color="auto"/>
+              <w:right w:val="single" w:sz="4" w:space="0" w:color="auto"/>
+            </w:tcBorders>
+          </w:tcPr>
+          <w:p>
+            <w:r>
+              <w:t>18</w:t>
+            </w:r>
+          </w:p>
+        </w:tc>
+        <w:tc>
+          <w:tcPr>
+            <w:tcW w:type="dxa" w:w="2880"/>
+            <w:tcBorders>
+              <w:top w:val="single" w:sz="4" w:space="0" w:color="auto"/>
+              <w:left w:val="single" w:sz="4" w:space="0" w:color="auto"/>
+              <w:bottom w:val="single" w:sz="4" w:space="0" w:color="auto"/>
+              <w:right w:val="single" w:sz="4" w:space="0" w:color="auto"/>
+            </w:tcBorders>
+          </w:tcPr>
+          <w:p>
+            <w:r>
+              <w:t>December 09, 2023</w:t>
+            </w:r>
+          </w:p>
+        </w:tc>
+        <w:tc>
+          <w:tcPr>
+            <w:tcW w:type="dxa" w:w="2880"/>
+            <w:tcBorders>
+              <w:top w:val="single" w:sz="4" w:space="0" w:color="auto"/>
+              <w:left w:val="single" w:sz="4" w:space="0" w:color="auto"/>
+              <w:bottom w:val="single" w:sz="4" w:space="0" w:color="auto"/>
+              <w:right w:val="single" w:sz="4" w:space="0" w:color="auto"/>
+            </w:tcBorders>
+          </w:tcPr>
+          <w:p>
+            <w:r>
+              <w:t>02:05:27 PM</w:t>
+            </w:r>
+          </w:p>
+        </w:tc>
+      </w:tr>
+      <w:tr>
+        <w:tc>
+          <w:tcPr>
+            <w:tcW w:type="dxa" w:w="2880"/>
+            <w:tcBorders>
+              <w:top w:val="single" w:sz="4" w:space="0" w:color="auto"/>
+              <w:left w:val="single" w:sz="4" w:space="0" w:color="auto"/>
+              <w:bottom w:val="single" w:sz="4" w:space="0" w:color="auto"/>
+              <w:right w:val="single" w:sz="4" w:space="0" w:color="auto"/>
+            </w:tcBorders>
+          </w:tcPr>
+          <w:p>
+            <w:r>
+              <w:t>19</w:t>
+            </w:r>
+          </w:p>
+        </w:tc>
+        <w:tc>
+          <w:tcPr>
+            <w:tcW w:type="dxa" w:w="2880"/>
+            <w:tcBorders>
+              <w:top w:val="single" w:sz="4" w:space="0" w:color="auto"/>
+              <w:left w:val="single" w:sz="4" w:space="0" w:color="auto"/>
+              <w:bottom w:val="single" w:sz="4" w:space="0" w:color="auto"/>
+              <w:right w:val="single" w:sz="4" w:space="0" w:color="auto"/>
+            </w:tcBorders>
+          </w:tcPr>
+          <w:p>
+            <w:r>
+              <w:t>December 25, 2023</w:t>
+            </w:r>
+          </w:p>
+        </w:tc>
+        <w:tc>
+          <w:tcPr>
+            <w:tcW w:type="dxa" w:w="2880"/>
+            <w:tcBorders>
+              <w:top w:val="single" w:sz="4" w:space="0" w:color="auto"/>
+              <w:left w:val="single" w:sz="4" w:space="0" w:color="auto"/>
+              <w:bottom w:val="single" w:sz="4" w:space="0" w:color="auto"/>
+              <w:right w:val="single" w:sz="4" w:space="0" w:color="auto"/>
+            </w:tcBorders>
+          </w:tcPr>
+          <w:p>
+            <w:r>
+              <w:t>05:43:41 PM</w:t>
+            </w:r>
+          </w:p>
+        </w:tc>
+      </w:tr>
+      <w:tr>
+        <w:tc>
+          <w:tcPr>
+            <w:tcW w:type="dxa" w:w="2880"/>
+            <w:tcBorders>
+              <w:top w:val="single" w:sz="4" w:space="0" w:color="auto"/>
+              <w:left w:val="single" w:sz="4" w:space="0" w:color="auto"/>
+              <w:bottom w:val="single" w:sz="4" w:space="0" w:color="auto"/>
+              <w:right w:val="single" w:sz="4" w:space="0" w:color="auto"/>
+            </w:tcBorders>
+          </w:tcPr>
+          <w:p>
+            <w:r>
+              <w:t>20</w:t>
+            </w:r>
+          </w:p>
+        </w:tc>
+        <w:tc>
+          <w:tcPr>
+            <w:tcW w:type="dxa" w:w="2880"/>
+            <w:tcBorders>
+              <w:top w:val="single" w:sz="4" w:space="0" w:color="auto"/>
+              <w:left w:val="single" w:sz="4" w:space="0" w:color="auto"/>
+              <w:bottom w:val="single" w:sz="4" w:space="0" w:color="auto"/>
+              <w:right w:val="single" w:sz="4" w:space="0" w:color="auto"/>
+            </w:tcBorders>
+          </w:tcPr>
+          <w:p>
+            <w:r>
+              <w:t>January 31, 2024</w:t>
+            </w:r>
+          </w:p>
+        </w:tc>
+        <w:tc>
+          <w:tcPr>
+            <w:tcW w:type="dxa" w:w="2880"/>
+            <w:tcBorders>
+              <w:top w:val="single" w:sz="4" w:space="0" w:color="auto"/>
+              <w:left w:val="single" w:sz="4" w:space="0" w:color="auto"/>
+              <w:bottom w:val="single" w:sz="4" w:space="0" w:color="auto"/>
+              <w:right w:val="single" w:sz="4" w:space="0" w:color="auto"/>
+            </w:tcBorders>
+          </w:tcPr>
+          <w:p>
+            <w:r>
+              <w:t>11:29:05 AM</w:t>
+            </w:r>
+          </w:p>
+        </w:tc>
+      </w:tr>
+      <w:tr>
+        <w:tc>
+          <w:tcPr>
+            <w:tcW w:type="dxa" w:w="2880"/>
+            <w:tcBorders>
+              <w:top w:val="single" w:sz="4" w:space="0" w:color="auto"/>
+              <w:left w:val="single" w:sz="4" w:space="0" w:color="auto"/>
+              <w:bottom w:val="single" w:sz="4" w:space="0" w:color="auto"/>
+              <w:right w:val="single" w:sz="4" w:space="0" w:color="auto"/>
+            </w:tcBorders>
+          </w:tcPr>
+          <w:p>
+            <w:r>
+              <w:t>21</w:t>
+            </w:r>
+          </w:p>
+        </w:tc>
+        <w:tc>
+          <w:tcPr>
+            <w:tcW w:type="dxa" w:w="2880"/>
+            <w:tcBorders>
+              <w:top w:val="single" w:sz="4" w:space="0" w:color="auto"/>
+              <w:left w:val="single" w:sz="4" w:space="0" w:color="auto"/>
+              <w:bottom w:val="single" w:sz="4" w:space="0" w:color="auto"/>
+              <w:right w:val="single" w:sz="4" w:space="0" w:color="auto"/>
+            </w:tcBorders>
+          </w:tcPr>
+          <w:p>
+            <w:r>
+              <w:t>February 09, 2024</w:t>
+            </w:r>
+          </w:p>
+        </w:tc>
+        <w:tc>
+          <w:tcPr>
+            <w:tcW w:type="dxa" w:w="2880"/>
+            <w:tcBorders>
+              <w:top w:val="single" w:sz="4" w:space="0" w:color="auto"/>
+              <w:left w:val="single" w:sz="4" w:space="0" w:color="auto"/>
+              <w:bottom w:val="single" w:sz="4" w:space="0" w:color="auto"/>
+              <w:right w:val="single" w:sz="4" w:space="0" w:color="auto"/>
+            </w:tcBorders>
+          </w:tcPr>
+          <w:p>
+            <w:r>
+              <w:t>05:45:37 PM</w:t>
+            </w:r>
+          </w:p>
+        </w:tc>
+      </w:tr>
+      <w:tr>
+        <w:tc>
+          <w:tcPr>
+            <w:tcW w:type="dxa" w:w="2880"/>
             <w:tcBorders>
               <w:top w:val="single" w:sz="4" w:space="0" w:color="auto"/>
               <w:left w:val="single" w:sz="4" w:space="0" w:color="auto"/>
@@ -268,7 +1221,7 @@
         </w:tc>
         <w:tc>
           <w:tcPr>
-            <w:tcW w:type="dxa" w:w="1234"/>
+            <w:tcW w:type="dxa" w:w="2880"/>
             <w:tcBorders>
               <w:top w:val="single" w:sz="4" w:space="0" w:color="auto"/>
               <w:left w:val="single" w:sz="4" w:space="0" w:color="auto"/>
@@ -278,13 +1231,13 @@
           </w:tcPr>
           <w:p>
             <w:r>
-              <w:t>2023</w:t>
+              <w:t>February 16, 2024</w:t>
             </w:r>
           </w:p>
         </w:tc>
         <w:tc>
           <w:tcPr>
-            <w:tcW w:type="dxa" w:w="1234"/>
+            <w:tcW w:type="dxa" w:w="2880"/>
             <w:tcBorders>
               <w:top w:val="single" w:sz="4" w:space="0" w:color="auto"/>
               <w:left w:val="single" w:sz="4" w:space="0" w:color="auto"/>
@@ -294,13 +1247,15 @@
           </w:tcPr>
           <w:p>
             <w:r>
-              <w:t>05</w:t>
+              <w:t>04:19:01 AM</w:t>
             </w:r>
           </w:p>
         </w:tc>
+      </w:tr>
+      <w:tr>
         <w:tc>
           <w:tcPr>
-            <w:tcW w:type="dxa" w:w="1234"/>
+            <w:tcW w:type="dxa" w:w="2880"/>
             <w:tcBorders>
               <w:top w:val="single" w:sz="4" w:space="0" w:color="auto"/>
               <w:left w:val="single" w:sz="4" w:space="0" w:color="auto"/>
@@ -310,13 +1265,13 @@
           </w:tcPr>
           <w:p>
             <w:r>
-              <w:t>56</w:t>
+              <w:t>23</w:t>
             </w:r>
           </w:p>
         </w:tc>
         <w:tc>
           <w:tcPr>
-            <w:tcW w:type="dxa" w:w="1234"/>
+            <w:tcW w:type="dxa" w:w="2880"/>
             <w:tcBorders>
               <w:top w:val="single" w:sz="4" w:space="0" w:color="auto"/>
               <w:left w:val="single" w:sz="4" w:space="0" w:color="auto"/>
@@ -326,13 +1281,13 @@
           </w:tcPr>
           <w:p>
             <w:r>
-              <w:t>39</w:t>
+              <w:t>February 28, 2024</w:t>
             </w:r>
           </w:p>
         </w:tc>
         <w:tc>
           <w:tcPr>
-            <w:tcW w:type="dxa" w:w="1234"/>
+            <w:tcW w:type="dxa" w:w="2880"/>
             <w:tcBorders>
               <w:top w:val="single" w:sz="4" w:space="0" w:color="auto"/>
               <w:left w:val="single" w:sz="4" w:space="0" w:color="auto"/>
@@ -342,7 +1297,7 @@
           </w:tcPr>
           <w:p>
             <w:r>
-              <w:t>PM</w:t>
+              <w:t>08:30:23 AM</w:t>
             </w:r>
           </w:p>
         </w:tc>
@@ -350,7 +1305,7 @@
       <w:tr>
         <w:tc>
           <w:tcPr>
-            <w:tcW w:type="dxa" w:w="1234"/>
+            <w:tcW w:type="dxa" w:w="2880"/>
             <w:tcBorders>
               <w:top w:val="single" w:sz="4" w:space="0" w:color="auto"/>
               <w:left w:val="single" w:sz="4" w:space="0" w:color="auto"/>
@@ -360,13 +1315,13 @@
           </w:tcPr>
           <w:p>
             <w:r>
-              <w:t>March</w:t>
+              <w:t>24</w:t>
             </w:r>
           </w:p>
         </w:tc>
         <w:tc>
           <w:tcPr>
-            <w:tcW w:type="dxa" w:w="1234"/>
+            <w:tcW w:type="dxa" w:w="2880"/>
             <w:tcBorders>
               <w:top w:val="single" w:sz="4" w:space="0" w:color="auto"/>
               <w:left w:val="single" w:sz="4" w:space="0" w:color="auto"/>
@@ -376,13 +1331,13 @@
           </w:tcPr>
           <w:p>
             <w:r>
-              <w:t>18</w:t>
+              <w:t>March 15, 2024</w:t>
             </w:r>
           </w:p>
         </w:tc>
         <w:tc>
           <w:tcPr>
-            <w:tcW w:type="dxa" w:w="1234"/>
+            <w:tcW w:type="dxa" w:w="2880"/>
             <w:tcBorders>
               <w:top w:val="single" w:sz="4" w:space="0" w:color="auto"/>
               <w:left w:val="single" w:sz="4" w:space="0" w:color="auto"/>
@@ -392,71 +1347,7 @@
           </w:tcPr>
           <w:p>
             <w:r>
-              <w:t>2023</w:t>
-            </w:r>
-          </w:p>
-        </w:tc>
-        <w:tc>
-          <w:tcPr>
-            <w:tcW w:type="dxa" w:w="1234"/>
-            <w:tcBorders>
-              <w:top w:val="single" w:sz="4" w:space="0" w:color="auto"/>
-              <w:left w:val="single" w:sz="4" w:space="0" w:color="auto"/>
-              <w:bottom w:val="single" w:sz="4" w:space="0" w:color="auto"/>
-              <w:right w:val="single" w:sz="4" w:space="0" w:color="auto"/>
-            </w:tcBorders>
-          </w:tcPr>
-          <w:p>
-            <w:r>
-              <w:t>09</w:t>
-            </w:r>
-          </w:p>
-        </w:tc>
-        <w:tc>
-          <w:tcPr>
-            <w:tcW w:type="dxa" w:w="1234"/>
-            <w:tcBorders>
-              <w:top w:val="single" w:sz="4" w:space="0" w:color="auto"/>
-              <w:left w:val="single" w:sz="4" w:space="0" w:color="auto"/>
-              <w:bottom w:val="single" w:sz="4" w:space="0" w:color="auto"/>
-              <w:right w:val="single" w:sz="4" w:space="0" w:color="auto"/>
-            </w:tcBorders>
-          </w:tcPr>
-          <w:p>
-            <w:r>
-              <w:t>06</w:t>
-            </w:r>
-          </w:p>
-        </w:tc>
-        <w:tc>
-          <w:tcPr>
-            <w:tcW w:type="dxa" w:w="1234"/>
-            <w:tcBorders>
-              <w:top w:val="single" w:sz="4" w:space="0" w:color="auto"/>
-              <w:left w:val="single" w:sz="4" w:space="0" w:color="auto"/>
-              <w:bottom w:val="single" w:sz="4" w:space="0" w:color="auto"/>
-              <w:right w:val="single" w:sz="4" w:space="0" w:color="auto"/>
-            </w:tcBorders>
-          </w:tcPr>
-          <w:p>
-            <w:r>
-              <w:t>01</w:t>
-            </w:r>
-          </w:p>
-        </w:tc>
-        <w:tc>
-          <w:tcPr>
-            <w:tcW w:type="dxa" w:w="1234"/>
-            <w:tcBorders>
-              <w:top w:val="single" w:sz="4" w:space="0" w:color="auto"/>
-              <w:left w:val="single" w:sz="4" w:space="0" w:color="auto"/>
-              <w:bottom w:val="single" w:sz="4" w:space="0" w:color="auto"/>
-              <w:right w:val="single" w:sz="4" w:space="0" w:color="auto"/>
-            </w:tcBorders>
-          </w:tcPr>
-          <w:p>
-            <w:r>
-              <w:t>AM</w:t>
+              <w:t>09:15:39 AM</w:t>
             </w:r>
           </w:p>
         </w:tc>
@@ -464,1097 +1355,7 @@
       <w:tr>
         <w:tc>
           <w:tcPr>
-            <w:tcW w:type="dxa" w:w="1234"/>
-            <w:tcBorders>
-              <w:top w:val="single" w:sz="4" w:space="0" w:color="auto"/>
-              <w:left w:val="single" w:sz="4" w:space="0" w:color="auto"/>
-              <w:bottom w:val="single" w:sz="4" w:space="0" w:color="auto"/>
-              <w:right w:val="single" w:sz="4" w:space="0" w:color="auto"/>
-            </w:tcBorders>
-          </w:tcPr>
-          <w:p>
-            <w:r>
-              <w:t>March</w:t>
-            </w:r>
-          </w:p>
-        </w:tc>
-        <w:tc>
-          <w:tcPr>
-            <w:tcW w:type="dxa" w:w="1234"/>
-            <w:tcBorders>
-              <w:top w:val="single" w:sz="4" w:space="0" w:color="auto"/>
-              <w:left w:val="single" w:sz="4" w:space="0" w:color="auto"/>
-              <w:bottom w:val="single" w:sz="4" w:space="0" w:color="auto"/>
-              <w:right w:val="single" w:sz="4" w:space="0" w:color="auto"/>
-            </w:tcBorders>
-          </w:tcPr>
-          <w:p>
-            <w:r>
-              <w:t>18</w:t>
-            </w:r>
-          </w:p>
-        </w:tc>
-        <w:tc>
-          <w:tcPr>
-            <w:tcW w:type="dxa" w:w="1234"/>
-            <w:tcBorders>
-              <w:top w:val="single" w:sz="4" w:space="0" w:color="auto"/>
-              <w:left w:val="single" w:sz="4" w:space="0" w:color="auto"/>
-              <w:bottom w:val="single" w:sz="4" w:space="0" w:color="auto"/>
-              <w:right w:val="single" w:sz="4" w:space="0" w:color="auto"/>
-            </w:tcBorders>
-          </w:tcPr>
-          <w:p>
-            <w:r>
-              <w:t>2023</w:t>
-            </w:r>
-          </w:p>
-        </w:tc>
-        <w:tc>
-          <w:tcPr>
-            <w:tcW w:type="dxa" w:w="1234"/>
-            <w:tcBorders>
-              <w:top w:val="single" w:sz="4" w:space="0" w:color="auto"/>
-              <w:left w:val="single" w:sz="4" w:space="0" w:color="auto"/>
-              <w:bottom w:val="single" w:sz="4" w:space="0" w:color="auto"/>
-              <w:right w:val="single" w:sz="4" w:space="0" w:color="auto"/>
-            </w:tcBorders>
-          </w:tcPr>
-          <w:p>
-            <w:r>
-              <w:t>09</w:t>
-            </w:r>
-          </w:p>
-        </w:tc>
-        <w:tc>
-          <w:tcPr>
-            <w:tcW w:type="dxa" w:w="1234"/>
-            <w:tcBorders>
-              <w:top w:val="single" w:sz="4" w:space="0" w:color="auto"/>
-              <w:left w:val="single" w:sz="4" w:space="0" w:color="auto"/>
-              <w:bottom w:val="single" w:sz="4" w:space="0" w:color="auto"/>
-              <w:right w:val="single" w:sz="4" w:space="0" w:color="auto"/>
-            </w:tcBorders>
-          </w:tcPr>
-          <w:p>
-            <w:r>
-              <w:t>06</w:t>
-            </w:r>
-          </w:p>
-        </w:tc>
-        <w:tc>
-          <w:tcPr>
-            <w:tcW w:type="dxa" w:w="1234"/>
-            <w:tcBorders>
-              <w:top w:val="single" w:sz="4" w:space="0" w:color="auto"/>
-              <w:left w:val="single" w:sz="4" w:space="0" w:color="auto"/>
-              <w:bottom w:val="single" w:sz="4" w:space="0" w:color="auto"/>
-              <w:right w:val="single" w:sz="4" w:space="0" w:color="auto"/>
-            </w:tcBorders>
-          </w:tcPr>
-          <w:p>
-            <w:r>
-              <w:t>03</w:t>
-            </w:r>
-          </w:p>
-        </w:tc>
-        <w:tc>
-          <w:tcPr>
-            <w:tcW w:type="dxa" w:w="1234"/>
-            <w:tcBorders>
-              <w:top w:val="single" w:sz="4" w:space="0" w:color="auto"/>
-              <w:left w:val="single" w:sz="4" w:space="0" w:color="auto"/>
-              <w:bottom w:val="single" w:sz="4" w:space="0" w:color="auto"/>
-              <w:right w:val="single" w:sz="4" w:space="0" w:color="auto"/>
-            </w:tcBorders>
-          </w:tcPr>
-          <w:p>
-            <w:r>
-              <w:t>AM</w:t>
-            </w:r>
-          </w:p>
-        </w:tc>
-      </w:tr>
-      <w:tr>
-        <w:tc>
-          <w:tcPr>
-            <w:tcW w:type="dxa" w:w="1234"/>
-            <w:tcBorders>
-              <w:top w:val="single" w:sz="4" w:space="0" w:color="auto"/>
-              <w:left w:val="single" w:sz="4" w:space="0" w:color="auto"/>
-              <w:bottom w:val="single" w:sz="4" w:space="0" w:color="auto"/>
-              <w:right w:val="single" w:sz="4" w:space="0" w:color="auto"/>
-            </w:tcBorders>
-          </w:tcPr>
-          <w:p>
-            <w:r>
-              <w:t>March</w:t>
-            </w:r>
-          </w:p>
-        </w:tc>
-        <w:tc>
-          <w:tcPr>
-            <w:tcW w:type="dxa" w:w="1234"/>
-            <w:tcBorders>
-              <w:top w:val="single" w:sz="4" w:space="0" w:color="auto"/>
-              <w:left w:val="single" w:sz="4" w:space="0" w:color="auto"/>
-              <w:bottom w:val="single" w:sz="4" w:space="0" w:color="auto"/>
-              <w:right w:val="single" w:sz="4" w:space="0" w:color="auto"/>
-            </w:tcBorders>
-          </w:tcPr>
-          <w:p>
-            <w:r>
-              <w:t>21</w:t>
-            </w:r>
-          </w:p>
-        </w:tc>
-        <w:tc>
-          <w:tcPr>
-            <w:tcW w:type="dxa" w:w="1234"/>
-            <w:tcBorders>
-              <w:top w:val="single" w:sz="4" w:space="0" w:color="auto"/>
-              <w:left w:val="single" w:sz="4" w:space="0" w:color="auto"/>
-              <w:bottom w:val="single" w:sz="4" w:space="0" w:color="auto"/>
-              <w:right w:val="single" w:sz="4" w:space="0" w:color="auto"/>
-            </w:tcBorders>
-          </w:tcPr>
-          <w:p>
-            <w:r>
-              <w:t>2023</w:t>
-            </w:r>
-          </w:p>
-        </w:tc>
-        <w:tc>
-          <w:tcPr>
-            <w:tcW w:type="dxa" w:w="1234"/>
-            <w:tcBorders>
-              <w:top w:val="single" w:sz="4" w:space="0" w:color="auto"/>
-              <w:left w:val="single" w:sz="4" w:space="0" w:color="auto"/>
-              <w:bottom w:val="single" w:sz="4" w:space="0" w:color="auto"/>
-              <w:right w:val="single" w:sz="4" w:space="0" w:color="auto"/>
-            </w:tcBorders>
-          </w:tcPr>
-          <w:p>
-            <w:r>
-              <w:t>07</w:t>
-            </w:r>
-          </w:p>
-        </w:tc>
-        <w:tc>
-          <w:tcPr>
-            <w:tcW w:type="dxa" w:w="1234"/>
-            <w:tcBorders>
-              <w:top w:val="single" w:sz="4" w:space="0" w:color="auto"/>
-              <w:left w:val="single" w:sz="4" w:space="0" w:color="auto"/>
-              <w:bottom w:val="single" w:sz="4" w:space="0" w:color="auto"/>
-              <w:right w:val="single" w:sz="4" w:space="0" w:color="auto"/>
-            </w:tcBorders>
-          </w:tcPr>
-          <w:p>
-            <w:r>
-              <w:t>52</w:t>
-            </w:r>
-          </w:p>
-        </w:tc>
-        <w:tc>
-          <w:tcPr>
-            <w:tcW w:type="dxa" w:w="1234"/>
-            <w:tcBorders>
-              <w:top w:val="single" w:sz="4" w:space="0" w:color="auto"/>
-              <w:left w:val="single" w:sz="4" w:space="0" w:color="auto"/>
-              <w:bottom w:val="single" w:sz="4" w:space="0" w:color="auto"/>
-              <w:right w:val="single" w:sz="4" w:space="0" w:color="auto"/>
-            </w:tcBorders>
-          </w:tcPr>
-          <w:p>
-            <w:r>
-              <w:t>43</w:t>
-            </w:r>
-          </w:p>
-        </w:tc>
-        <w:tc>
-          <w:tcPr>
-            <w:tcW w:type="dxa" w:w="1234"/>
-            <w:tcBorders>
-              <w:top w:val="single" w:sz="4" w:space="0" w:color="auto"/>
-              <w:left w:val="single" w:sz="4" w:space="0" w:color="auto"/>
-              <w:bottom w:val="single" w:sz="4" w:space="0" w:color="auto"/>
-              <w:right w:val="single" w:sz="4" w:space="0" w:color="auto"/>
-            </w:tcBorders>
-          </w:tcPr>
-          <w:p>
-            <w:r>
-              <w:t>PM</w:t>
-            </w:r>
-          </w:p>
-        </w:tc>
-      </w:tr>
-      <w:tr>
-        <w:tc>
-          <w:tcPr>
-            <w:tcW w:type="dxa" w:w="1234"/>
-            <w:tcBorders>
-              <w:top w:val="single" w:sz="4" w:space="0" w:color="auto"/>
-              <w:left w:val="single" w:sz="4" w:space="0" w:color="auto"/>
-              <w:bottom w:val="single" w:sz="4" w:space="0" w:color="auto"/>
-              <w:right w:val="single" w:sz="4" w:space="0" w:color="auto"/>
-            </w:tcBorders>
-          </w:tcPr>
-          <w:p>
-            <w:r>
-              <w:t>March</w:t>
-            </w:r>
-          </w:p>
-        </w:tc>
-        <w:tc>
-          <w:tcPr>
-            <w:tcW w:type="dxa" w:w="1234"/>
-            <w:tcBorders>
-              <w:top w:val="single" w:sz="4" w:space="0" w:color="auto"/>
-              <w:left w:val="single" w:sz="4" w:space="0" w:color="auto"/>
-              <w:bottom w:val="single" w:sz="4" w:space="0" w:color="auto"/>
-              <w:right w:val="single" w:sz="4" w:space="0" w:color="auto"/>
-            </w:tcBorders>
-          </w:tcPr>
-          <w:p>
-            <w:r>
-              <w:t>22</w:t>
-            </w:r>
-          </w:p>
-        </w:tc>
-        <w:tc>
-          <w:tcPr>
-            <w:tcW w:type="dxa" w:w="1234"/>
-            <w:tcBorders>
-              <w:top w:val="single" w:sz="4" w:space="0" w:color="auto"/>
-              <w:left w:val="single" w:sz="4" w:space="0" w:color="auto"/>
-              <w:bottom w:val="single" w:sz="4" w:space="0" w:color="auto"/>
-              <w:right w:val="single" w:sz="4" w:space="0" w:color="auto"/>
-            </w:tcBorders>
-          </w:tcPr>
-          <w:p>
-            <w:r>
-              <w:t>2023</w:t>
-            </w:r>
-          </w:p>
-        </w:tc>
-        <w:tc>
-          <w:tcPr>
-            <w:tcW w:type="dxa" w:w="1234"/>
-            <w:tcBorders>
-              <w:top w:val="single" w:sz="4" w:space="0" w:color="auto"/>
-              <w:left w:val="single" w:sz="4" w:space="0" w:color="auto"/>
-              <w:bottom w:val="single" w:sz="4" w:space="0" w:color="auto"/>
-              <w:right w:val="single" w:sz="4" w:space="0" w:color="auto"/>
-            </w:tcBorders>
-          </w:tcPr>
-          <w:p>
-            <w:r>
-              <w:t>02</w:t>
-            </w:r>
-          </w:p>
-        </w:tc>
-        <w:tc>
-          <w:tcPr>
-            <w:tcW w:type="dxa" w:w="1234"/>
-            <w:tcBorders>
-              <w:top w:val="single" w:sz="4" w:space="0" w:color="auto"/>
-              <w:left w:val="single" w:sz="4" w:space="0" w:color="auto"/>
-              <w:bottom w:val="single" w:sz="4" w:space="0" w:color="auto"/>
-              <w:right w:val="single" w:sz="4" w:space="0" w:color="auto"/>
-            </w:tcBorders>
-          </w:tcPr>
-          <w:p>
-            <w:r>
-              <w:t>40</w:t>
-            </w:r>
-          </w:p>
-        </w:tc>
-        <w:tc>
-          <w:tcPr>
-            <w:tcW w:type="dxa" w:w="1234"/>
-            <w:tcBorders>
-              <w:top w:val="single" w:sz="4" w:space="0" w:color="auto"/>
-              <w:left w:val="single" w:sz="4" w:space="0" w:color="auto"/>
-              <w:bottom w:val="single" w:sz="4" w:space="0" w:color="auto"/>
-              <w:right w:val="single" w:sz="4" w:space="0" w:color="auto"/>
-            </w:tcBorders>
-          </w:tcPr>
-          <w:p>
-            <w:r>
-              <w:t>33</w:t>
-            </w:r>
-          </w:p>
-        </w:tc>
-        <w:tc>
-          <w:tcPr>
-            <w:tcW w:type="dxa" w:w="1234"/>
-            <w:tcBorders>
-              <w:top w:val="single" w:sz="4" w:space="0" w:color="auto"/>
-              <w:left w:val="single" w:sz="4" w:space="0" w:color="auto"/>
-              <w:bottom w:val="single" w:sz="4" w:space="0" w:color="auto"/>
-              <w:right w:val="single" w:sz="4" w:space="0" w:color="auto"/>
-            </w:tcBorders>
-          </w:tcPr>
-          <w:p>
-            <w:r>
-              <w:t>PM</w:t>
-            </w:r>
-          </w:p>
-        </w:tc>
-      </w:tr>
-      <w:tr>
-        <w:tc>
-          <w:tcPr>
-            <w:tcW w:type="dxa" w:w="1234"/>
-            <w:tcBorders>
-              <w:top w:val="single" w:sz="4" w:space="0" w:color="auto"/>
-              <w:left w:val="single" w:sz="4" w:space="0" w:color="auto"/>
-              <w:bottom w:val="single" w:sz="4" w:space="0" w:color="auto"/>
-              <w:right w:val="single" w:sz="4" w:space="0" w:color="auto"/>
-            </w:tcBorders>
-          </w:tcPr>
-          <w:p>
-            <w:r>
-              <w:t>March</w:t>
-            </w:r>
-          </w:p>
-        </w:tc>
-        <w:tc>
-          <w:tcPr>
-            <w:tcW w:type="dxa" w:w="1234"/>
-            <w:tcBorders>
-              <w:top w:val="single" w:sz="4" w:space="0" w:color="auto"/>
-              <w:left w:val="single" w:sz="4" w:space="0" w:color="auto"/>
-              <w:bottom w:val="single" w:sz="4" w:space="0" w:color="auto"/>
-              <w:right w:val="single" w:sz="4" w:space="0" w:color="auto"/>
-            </w:tcBorders>
-          </w:tcPr>
-          <w:p>
-            <w:r>
-              <w:t>30</w:t>
-            </w:r>
-          </w:p>
-        </w:tc>
-        <w:tc>
-          <w:tcPr>
-            <w:tcW w:type="dxa" w:w="1234"/>
-            <w:tcBorders>
-              <w:top w:val="single" w:sz="4" w:space="0" w:color="auto"/>
-              <w:left w:val="single" w:sz="4" w:space="0" w:color="auto"/>
-              <w:bottom w:val="single" w:sz="4" w:space="0" w:color="auto"/>
-              <w:right w:val="single" w:sz="4" w:space="0" w:color="auto"/>
-            </w:tcBorders>
-          </w:tcPr>
-          <w:p>
-            <w:r>
-              <w:t>2023</w:t>
-            </w:r>
-          </w:p>
-        </w:tc>
-        <w:tc>
-          <w:tcPr>
-            <w:tcW w:type="dxa" w:w="1234"/>
-            <w:tcBorders>
-              <w:top w:val="single" w:sz="4" w:space="0" w:color="auto"/>
-              <w:left w:val="single" w:sz="4" w:space="0" w:color="auto"/>
-              <w:bottom w:val="single" w:sz="4" w:space="0" w:color="auto"/>
-              <w:right w:val="single" w:sz="4" w:space="0" w:color="auto"/>
-            </w:tcBorders>
-          </w:tcPr>
-          <w:p>
-            <w:r>
-              <w:t>02</w:t>
-            </w:r>
-          </w:p>
-        </w:tc>
-        <w:tc>
-          <w:tcPr>
-            <w:tcW w:type="dxa" w:w="1234"/>
-            <w:tcBorders>
-              <w:top w:val="single" w:sz="4" w:space="0" w:color="auto"/>
-              <w:left w:val="single" w:sz="4" w:space="0" w:color="auto"/>
-              <w:bottom w:val="single" w:sz="4" w:space="0" w:color="auto"/>
-              <w:right w:val="single" w:sz="4" w:space="0" w:color="auto"/>
-            </w:tcBorders>
-          </w:tcPr>
-          <w:p>
-            <w:r>
-              <w:t>50</w:t>
-            </w:r>
-          </w:p>
-        </w:tc>
-        <w:tc>
-          <w:tcPr>
-            <w:tcW w:type="dxa" w:w="1234"/>
-            <w:tcBorders>
-              <w:top w:val="single" w:sz="4" w:space="0" w:color="auto"/>
-              <w:left w:val="single" w:sz="4" w:space="0" w:color="auto"/>
-              <w:bottom w:val="single" w:sz="4" w:space="0" w:color="auto"/>
-              <w:right w:val="single" w:sz="4" w:space="0" w:color="auto"/>
-            </w:tcBorders>
-          </w:tcPr>
-          <w:p>
-            <w:r>
-              <w:t>53</w:t>
-            </w:r>
-          </w:p>
-        </w:tc>
-        <w:tc>
-          <w:tcPr>
-            <w:tcW w:type="dxa" w:w="1234"/>
-            <w:tcBorders>
-              <w:top w:val="single" w:sz="4" w:space="0" w:color="auto"/>
-              <w:left w:val="single" w:sz="4" w:space="0" w:color="auto"/>
-              <w:bottom w:val="single" w:sz="4" w:space="0" w:color="auto"/>
-              <w:right w:val="single" w:sz="4" w:space="0" w:color="auto"/>
-            </w:tcBorders>
-          </w:tcPr>
-          <w:p>
-            <w:r>
-              <w:t>AM</w:t>
-            </w:r>
-          </w:p>
-        </w:tc>
-      </w:tr>
-      <w:tr>
-        <w:tc>
-          <w:tcPr>
-            <w:tcW w:type="dxa" w:w="1234"/>
-            <w:tcBorders>
-              <w:top w:val="single" w:sz="4" w:space="0" w:color="auto"/>
-              <w:left w:val="single" w:sz="4" w:space="0" w:color="auto"/>
-              <w:bottom w:val="single" w:sz="4" w:space="0" w:color="auto"/>
-              <w:right w:val="single" w:sz="4" w:space="0" w:color="auto"/>
-            </w:tcBorders>
-          </w:tcPr>
-          <w:p>
-            <w:r>
-              <w:t>April</w:t>
-            </w:r>
-          </w:p>
-        </w:tc>
-        <w:tc>
-          <w:tcPr>
-            <w:tcW w:type="dxa" w:w="1234"/>
-            <w:tcBorders>
-              <w:top w:val="single" w:sz="4" w:space="0" w:color="auto"/>
-              <w:left w:val="single" w:sz="4" w:space="0" w:color="auto"/>
-              <w:bottom w:val="single" w:sz="4" w:space="0" w:color="auto"/>
-              <w:right w:val="single" w:sz="4" w:space="0" w:color="auto"/>
-            </w:tcBorders>
-          </w:tcPr>
-          <w:p>
-            <w:r>
-              <w:t>17</w:t>
-            </w:r>
-          </w:p>
-        </w:tc>
-        <w:tc>
-          <w:tcPr>
-            <w:tcW w:type="dxa" w:w="1234"/>
-            <w:tcBorders>
-              <w:top w:val="single" w:sz="4" w:space="0" w:color="auto"/>
-              <w:left w:val="single" w:sz="4" w:space="0" w:color="auto"/>
-              <w:bottom w:val="single" w:sz="4" w:space="0" w:color="auto"/>
-              <w:right w:val="single" w:sz="4" w:space="0" w:color="auto"/>
-            </w:tcBorders>
-          </w:tcPr>
-          <w:p>
-            <w:r>
-              <w:t>2023</w:t>
-            </w:r>
-          </w:p>
-        </w:tc>
-        <w:tc>
-          <w:tcPr>
-            <w:tcW w:type="dxa" w:w="1234"/>
-            <w:tcBorders>
-              <w:top w:val="single" w:sz="4" w:space="0" w:color="auto"/>
-              <w:left w:val="single" w:sz="4" w:space="0" w:color="auto"/>
-              <w:bottom w:val="single" w:sz="4" w:space="0" w:color="auto"/>
-              <w:right w:val="single" w:sz="4" w:space="0" w:color="auto"/>
-            </w:tcBorders>
-          </w:tcPr>
-          <w:p>
-            <w:r>
-              <w:t>04</w:t>
-            </w:r>
-          </w:p>
-        </w:tc>
-        <w:tc>
-          <w:tcPr>
-            <w:tcW w:type="dxa" w:w="1234"/>
-            <w:tcBorders>
-              <w:top w:val="single" w:sz="4" w:space="0" w:color="auto"/>
-              <w:left w:val="single" w:sz="4" w:space="0" w:color="auto"/>
-              <w:bottom w:val="single" w:sz="4" w:space="0" w:color="auto"/>
-              <w:right w:val="single" w:sz="4" w:space="0" w:color="auto"/>
-            </w:tcBorders>
-          </w:tcPr>
-          <w:p>
-            <w:r>
-              <w:t>37</w:t>
-            </w:r>
-          </w:p>
-        </w:tc>
-        <w:tc>
-          <w:tcPr>
-            <w:tcW w:type="dxa" w:w="1234"/>
-            <w:tcBorders>
-              <w:top w:val="single" w:sz="4" w:space="0" w:color="auto"/>
-              <w:left w:val="single" w:sz="4" w:space="0" w:color="auto"/>
-              <w:bottom w:val="single" w:sz="4" w:space="0" w:color="auto"/>
-              <w:right w:val="single" w:sz="4" w:space="0" w:color="auto"/>
-            </w:tcBorders>
-          </w:tcPr>
-          <w:p>
-            <w:r>
-              <w:t>30</w:t>
-            </w:r>
-          </w:p>
-        </w:tc>
-        <w:tc>
-          <w:tcPr>
-            <w:tcW w:type="dxa" w:w="1234"/>
-            <w:tcBorders>
-              <w:top w:val="single" w:sz="4" w:space="0" w:color="auto"/>
-              <w:left w:val="single" w:sz="4" w:space="0" w:color="auto"/>
-              <w:bottom w:val="single" w:sz="4" w:space="0" w:color="auto"/>
-              <w:right w:val="single" w:sz="4" w:space="0" w:color="auto"/>
-            </w:tcBorders>
-          </w:tcPr>
-          <w:p>
-            <w:r>
-              <w:t>AM</w:t>
-            </w:r>
-          </w:p>
-        </w:tc>
-      </w:tr>
-      <w:tr>
-        <w:tc>
-          <w:tcPr>
-            <w:tcW w:type="dxa" w:w="1234"/>
-            <w:tcBorders>
-              <w:top w:val="single" w:sz="4" w:space="0" w:color="auto"/>
-              <w:left w:val="single" w:sz="4" w:space="0" w:color="auto"/>
-              <w:bottom w:val="single" w:sz="4" w:space="0" w:color="auto"/>
-              <w:right w:val="single" w:sz="4" w:space="0" w:color="auto"/>
-            </w:tcBorders>
-          </w:tcPr>
-          <w:p>
-            <w:r>
-              <w:t>April</w:t>
-            </w:r>
-          </w:p>
-        </w:tc>
-        <w:tc>
-          <w:tcPr>
-            <w:tcW w:type="dxa" w:w="1234"/>
-            <w:tcBorders>
-              <w:top w:val="single" w:sz="4" w:space="0" w:color="auto"/>
-              <w:left w:val="single" w:sz="4" w:space="0" w:color="auto"/>
-              <w:bottom w:val="single" w:sz="4" w:space="0" w:color="auto"/>
-              <w:right w:val="single" w:sz="4" w:space="0" w:color="auto"/>
-            </w:tcBorders>
-          </w:tcPr>
-          <w:p>
-            <w:r>
-              <w:t>17</w:t>
-            </w:r>
-          </w:p>
-        </w:tc>
-        <w:tc>
-          <w:tcPr>
-            <w:tcW w:type="dxa" w:w="1234"/>
-            <w:tcBorders>
-              <w:top w:val="single" w:sz="4" w:space="0" w:color="auto"/>
-              <w:left w:val="single" w:sz="4" w:space="0" w:color="auto"/>
-              <w:bottom w:val="single" w:sz="4" w:space="0" w:color="auto"/>
-              <w:right w:val="single" w:sz="4" w:space="0" w:color="auto"/>
-            </w:tcBorders>
-          </w:tcPr>
-          <w:p>
-            <w:r>
-              <w:t>2023</w:t>
-            </w:r>
-          </w:p>
-        </w:tc>
-        <w:tc>
-          <w:tcPr>
-            <w:tcW w:type="dxa" w:w="1234"/>
-            <w:tcBorders>
-              <w:top w:val="single" w:sz="4" w:space="0" w:color="auto"/>
-              <w:left w:val="single" w:sz="4" w:space="0" w:color="auto"/>
-              <w:bottom w:val="single" w:sz="4" w:space="0" w:color="auto"/>
-              <w:right w:val="single" w:sz="4" w:space="0" w:color="auto"/>
-            </w:tcBorders>
-          </w:tcPr>
-          <w:p>
-            <w:r>
-              <w:t>04</w:t>
-            </w:r>
-          </w:p>
-        </w:tc>
-        <w:tc>
-          <w:tcPr>
-            <w:tcW w:type="dxa" w:w="1234"/>
-            <w:tcBorders>
-              <w:top w:val="single" w:sz="4" w:space="0" w:color="auto"/>
-              <w:left w:val="single" w:sz="4" w:space="0" w:color="auto"/>
-              <w:bottom w:val="single" w:sz="4" w:space="0" w:color="auto"/>
-              <w:right w:val="single" w:sz="4" w:space="0" w:color="auto"/>
-            </w:tcBorders>
-          </w:tcPr>
-          <w:p>
-            <w:r>
-              <w:t>37</w:t>
-            </w:r>
-          </w:p>
-        </w:tc>
-        <w:tc>
-          <w:tcPr>
-            <w:tcW w:type="dxa" w:w="1234"/>
-            <w:tcBorders>
-              <w:top w:val="single" w:sz="4" w:space="0" w:color="auto"/>
-              <w:left w:val="single" w:sz="4" w:space="0" w:color="auto"/>
-              <w:bottom w:val="single" w:sz="4" w:space="0" w:color="auto"/>
-              <w:right w:val="single" w:sz="4" w:space="0" w:color="auto"/>
-            </w:tcBorders>
-          </w:tcPr>
-          <w:p>
-            <w:r>
-              <w:t>31</w:t>
-            </w:r>
-          </w:p>
-        </w:tc>
-        <w:tc>
-          <w:tcPr>
-            <w:tcW w:type="dxa" w:w="1234"/>
-            <w:tcBorders>
-              <w:top w:val="single" w:sz="4" w:space="0" w:color="auto"/>
-              <w:left w:val="single" w:sz="4" w:space="0" w:color="auto"/>
-              <w:bottom w:val="single" w:sz="4" w:space="0" w:color="auto"/>
-              <w:right w:val="single" w:sz="4" w:space="0" w:color="auto"/>
-            </w:tcBorders>
-          </w:tcPr>
-          <w:p>
-            <w:r>
-              <w:t>AM</w:t>
-            </w:r>
-          </w:p>
-        </w:tc>
-      </w:tr>
-      <w:tr>
-        <w:tc>
-          <w:tcPr>
-            <w:tcW w:type="dxa" w:w="1234"/>
-            <w:tcBorders>
-              <w:top w:val="single" w:sz="4" w:space="0" w:color="auto"/>
-              <w:left w:val="single" w:sz="4" w:space="0" w:color="auto"/>
-              <w:bottom w:val="single" w:sz="4" w:space="0" w:color="auto"/>
-              <w:right w:val="single" w:sz="4" w:space="0" w:color="auto"/>
-            </w:tcBorders>
-          </w:tcPr>
-          <w:p>
-            <w:r>
-              <w:t>June</w:t>
-            </w:r>
-          </w:p>
-        </w:tc>
-        <w:tc>
-          <w:tcPr>
-            <w:tcW w:type="dxa" w:w="1234"/>
-            <w:tcBorders>
-              <w:top w:val="single" w:sz="4" w:space="0" w:color="auto"/>
-              <w:left w:val="single" w:sz="4" w:space="0" w:color="auto"/>
-              <w:bottom w:val="single" w:sz="4" w:space="0" w:color="auto"/>
-              <w:right w:val="single" w:sz="4" w:space="0" w:color="auto"/>
-            </w:tcBorders>
-          </w:tcPr>
-          <w:p>
-            <w:r>
-              <w:t>10</w:t>
-            </w:r>
-          </w:p>
-        </w:tc>
-        <w:tc>
-          <w:tcPr>
-            <w:tcW w:type="dxa" w:w="1234"/>
-            <w:tcBorders>
-              <w:top w:val="single" w:sz="4" w:space="0" w:color="auto"/>
-              <w:left w:val="single" w:sz="4" w:space="0" w:color="auto"/>
-              <w:bottom w:val="single" w:sz="4" w:space="0" w:color="auto"/>
-              <w:right w:val="single" w:sz="4" w:space="0" w:color="auto"/>
-            </w:tcBorders>
-          </w:tcPr>
-          <w:p>
-            <w:r>
-              <w:t>2023</w:t>
-            </w:r>
-          </w:p>
-        </w:tc>
-        <w:tc>
-          <w:tcPr>
-            <w:tcW w:type="dxa" w:w="1234"/>
-            <w:tcBorders>
-              <w:top w:val="single" w:sz="4" w:space="0" w:color="auto"/>
-              <w:left w:val="single" w:sz="4" w:space="0" w:color="auto"/>
-              <w:bottom w:val="single" w:sz="4" w:space="0" w:color="auto"/>
-              <w:right w:val="single" w:sz="4" w:space="0" w:color="auto"/>
-            </w:tcBorders>
-          </w:tcPr>
-          <w:p>
-            <w:r>
-              <w:t>01</w:t>
-            </w:r>
-          </w:p>
-        </w:tc>
-        <w:tc>
-          <w:tcPr>
-            <w:tcW w:type="dxa" w:w="1234"/>
-            <w:tcBorders>
-              <w:top w:val="single" w:sz="4" w:space="0" w:color="auto"/>
-              <w:left w:val="single" w:sz="4" w:space="0" w:color="auto"/>
-              <w:bottom w:val="single" w:sz="4" w:space="0" w:color="auto"/>
-              <w:right w:val="single" w:sz="4" w:space="0" w:color="auto"/>
-            </w:tcBorders>
-          </w:tcPr>
-          <w:p>
-            <w:r>
-              <w:t>32</w:t>
-            </w:r>
-          </w:p>
-        </w:tc>
-        <w:tc>
-          <w:tcPr>
-            <w:tcW w:type="dxa" w:w="1234"/>
-            <w:tcBorders>
-              <w:top w:val="single" w:sz="4" w:space="0" w:color="auto"/>
-              <w:left w:val="single" w:sz="4" w:space="0" w:color="auto"/>
-              <w:bottom w:val="single" w:sz="4" w:space="0" w:color="auto"/>
-              <w:right w:val="single" w:sz="4" w:space="0" w:color="auto"/>
-            </w:tcBorders>
-          </w:tcPr>
-          <w:p>
-            <w:r>
-              <w:t>47</w:t>
-            </w:r>
-          </w:p>
-        </w:tc>
-        <w:tc>
-          <w:tcPr>
-            <w:tcW w:type="dxa" w:w="1234"/>
-            <w:tcBorders>
-              <w:top w:val="single" w:sz="4" w:space="0" w:color="auto"/>
-              <w:left w:val="single" w:sz="4" w:space="0" w:color="auto"/>
-              <w:bottom w:val="single" w:sz="4" w:space="0" w:color="auto"/>
-              <w:right w:val="single" w:sz="4" w:space="0" w:color="auto"/>
-            </w:tcBorders>
-          </w:tcPr>
-          <w:p>
-            <w:r>
-              <w:t>PM</w:t>
-            </w:r>
-          </w:p>
-        </w:tc>
-      </w:tr>
-      <w:tr>
-        <w:tc>
-          <w:tcPr>
-            <w:tcW w:type="dxa" w:w="1234"/>
-            <w:tcBorders>
-              <w:top w:val="single" w:sz="4" w:space="0" w:color="auto"/>
-              <w:left w:val="single" w:sz="4" w:space="0" w:color="auto"/>
-              <w:bottom w:val="single" w:sz="4" w:space="0" w:color="auto"/>
-              <w:right w:val="single" w:sz="4" w:space="0" w:color="auto"/>
-            </w:tcBorders>
-          </w:tcPr>
-          <w:p>
-            <w:r>
-              <w:t>July</w:t>
-            </w:r>
-          </w:p>
-        </w:tc>
-        <w:tc>
-          <w:tcPr>
-            <w:tcW w:type="dxa" w:w="1234"/>
-            <w:tcBorders>
-              <w:top w:val="single" w:sz="4" w:space="0" w:color="auto"/>
-              <w:left w:val="single" w:sz="4" w:space="0" w:color="auto"/>
-              <w:bottom w:val="single" w:sz="4" w:space="0" w:color="auto"/>
-              <w:right w:val="single" w:sz="4" w:space="0" w:color="auto"/>
-            </w:tcBorders>
-          </w:tcPr>
-          <w:p>
-            <w:r>
-              <w:t>04</w:t>
-            </w:r>
-          </w:p>
-        </w:tc>
-        <w:tc>
-          <w:tcPr>
-            <w:tcW w:type="dxa" w:w="1234"/>
-            <w:tcBorders>
-              <w:top w:val="single" w:sz="4" w:space="0" w:color="auto"/>
-              <w:left w:val="single" w:sz="4" w:space="0" w:color="auto"/>
-              <w:bottom w:val="single" w:sz="4" w:space="0" w:color="auto"/>
-              <w:right w:val="single" w:sz="4" w:space="0" w:color="auto"/>
-            </w:tcBorders>
-          </w:tcPr>
-          <w:p>
-            <w:r>
-              <w:t>2023</w:t>
-            </w:r>
-          </w:p>
-        </w:tc>
-        <w:tc>
-          <w:tcPr>
-            <w:tcW w:type="dxa" w:w="1234"/>
-            <w:tcBorders>
-              <w:top w:val="single" w:sz="4" w:space="0" w:color="auto"/>
-              <w:left w:val="single" w:sz="4" w:space="0" w:color="auto"/>
-              <w:bottom w:val="single" w:sz="4" w:space="0" w:color="auto"/>
-              <w:right w:val="single" w:sz="4" w:space="0" w:color="auto"/>
-            </w:tcBorders>
-          </w:tcPr>
-          <w:p>
-            <w:r>
-              <w:t>05</w:t>
-            </w:r>
-          </w:p>
-        </w:tc>
-        <w:tc>
-          <w:tcPr>
-            <w:tcW w:type="dxa" w:w="1234"/>
-            <w:tcBorders>
-              <w:top w:val="single" w:sz="4" w:space="0" w:color="auto"/>
-              <w:left w:val="single" w:sz="4" w:space="0" w:color="auto"/>
-              <w:bottom w:val="single" w:sz="4" w:space="0" w:color="auto"/>
-              <w:right w:val="single" w:sz="4" w:space="0" w:color="auto"/>
-            </w:tcBorders>
-          </w:tcPr>
-          <w:p>
-            <w:r>
-              <w:t>41</w:t>
-            </w:r>
-          </w:p>
-        </w:tc>
-        <w:tc>
-          <w:tcPr>
-            <w:tcW w:type="dxa" w:w="1234"/>
-            <w:tcBorders>
-              <w:top w:val="single" w:sz="4" w:space="0" w:color="auto"/>
-              <w:left w:val="single" w:sz="4" w:space="0" w:color="auto"/>
-              <w:bottom w:val="single" w:sz="4" w:space="0" w:color="auto"/>
-              <w:right w:val="single" w:sz="4" w:space="0" w:color="auto"/>
-            </w:tcBorders>
-          </w:tcPr>
-          <w:p>
-            <w:r>
-              <w:t>18</w:t>
-            </w:r>
-          </w:p>
-        </w:tc>
-        <w:tc>
-          <w:tcPr>
-            <w:tcW w:type="dxa" w:w="1234"/>
-            <w:tcBorders>
-              <w:top w:val="single" w:sz="4" w:space="0" w:color="auto"/>
-              <w:left w:val="single" w:sz="4" w:space="0" w:color="auto"/>
-              <w:bottom w:val="single" w:sz="4" w:space="0" w:color="auto"/>
-              <w:right w:val="single" w:sz="4" w:space="0" w:color="auto"/>
-            </w:tcBorders>
-          </w:tcPr>
-          <w:p>
-            <w:r>
-              <w:t>PM</w:t>
-            </w:r>
-          </w:p>
-        </w:tc>
-      </w:tr>
-      <w:tr>
-        <w:tc>
-          <w:tcPr>
-            <w:tcW w:type="dxa" w:w="1234"/>
-            <w:tcBorders>
-              <w:top w:val="single" w:sz="4" w:space="0" w:color="auto"/>
-              <w:left w:val="single" w:sz="4" w:space="0" w:color="auto"/>
-              <w:bottom w:val="single" w:sz="4" w:space="0" w:color="auto"/>
-              <w:right w:val="single" w:sz="4" w:space="0" w:color="auto"/>
-            </w:tcBorders>
-          </w:tcPr>
-          <w:p>
-            <w:r>
-              <w:t>July</w:t>
-            </w:r>
-          </w:p>
-        </w:tc>
-        <w:tc>
-          <w:tcPr>
-            <w:tcW w:type="dxa" w:w="1234"/>
-            <w:tcBorders>
-              <w:top w:val="single" w:sz="4" w:space="0" w:color="auto"/>
-              <w:left w:val="single" w:sz="4" w:space="0" w:color="auto"/>
-              <w:bottom w:val="single" w:sz="4" w:space="0" w:color="auto"/>
-              <w:right w:val="single" w:sz="4" w:space="0" w:color="auto"/>
-            </w:tcBorders>
-          </w:tcPr>
-          <w:p>
-            <w:r>
-              <w:t>04</w:t>
-            </w:r>
-          </w:p>
-        </w:tc>
-        <w:tc>
-          <w:tcPr>
-            <w:tcW w:type="dxa" w:w="1234"/>
-            <w:tcBorders>
-              <w:top w:val="single" w:sz="4" w:space="0" w:color="auto"/>
-              <w:left w:val="single" w:sz="4" w:space="0" w:color="auto"/>
-              <w:bottom w:val="single" w:sz="4" w:space="0" w:color="auto"/>
-              <w:right w:val="single" w:sz="4" w:space="0" w:color="auto"/>
-            </w:tcBorders>
-          </w:tcPr>
-          <w:p>
-            <w:r>
-              <w:t>2023</w:t>
-            </w:r>
-          </w:p>
-        </w:tc>
-        <w:tc>
-          <w:tcPr>
-            <w:tcW w:type="dxa" w:w="1234"/>
-            <w:tcBorders>
-              <w:top w:val="single" w:sz="4" w:space="0" w:color="auto"/>
-              <w:left w:val="single" w:sz="4" w:space="0" w:color="auto"/>
-              <w:bottom w:val="single" w:sz="4" w:space="0" w:color="auto"/>
-              <w:right w:val="single" w:sz="4" w:space="0" w:color="auto"/>
-            </w:tcBorders>
-          </w:tcPr>
-          <w:p>
-            <w:r>
-              <w:t>05</w:t>
-            </w:r>
-          </w:p>
-        </w:tc>
-        <w:tc>
-          <w:tcPr>
-            <w:tcW w:type="dxa" w:w="1234"/>
-            <w:tcBorders>
-              <w:top w:val="single" w:sz="4" w:space="0" w:color="auto"/>
-              <w:left w:val="single" w:sz="4" w:space="0" w:color="auto"/>
-              <w:bottom w:val="single" w:sz="4" w:space="0" w:color="auto"/>
-              <w:right w:val="single" w:sz="4" w:space="0" w:color="auto"/>
-            </w:tcBorders>
-          </w:tcPr>
-          <w:p>
-            <w:r>
-              <w:t>41</w:t>
-            </w:r>
-          </w:p>
-        </w:tc>
-        <w:tc>
-          <w:tcPr>
-            <w:tcW w:type="dxa" w:w="1234"/>
-            <w:tcBorders>
-              <w:top w:val="single" w:sz="4" w:space="0" w:color="auto"/>
-              <w:left w:val="single" w:sz="4" w:space="0" w:color="auto"/>
-              <w:bottom w:val="single" w:sz="4" w:space="0" w:color="auto"/>
-              <w:right w:val="single" w:sz="4" w:space="0" w:color="auto"/>
-            </w:tcBorders>
-          </w:tcPr>
-          <w:p>
-            <w:r>
-              <w:t>20</w:t>
-            </w:r>
-          </w:p>
-        </w:tc>
-        <w:tc>
-          <w:tcPr>
-            <w:tcW w:type="dxa" w:w="1234"/>
-            <w:tcBorders>
-              <w:top w:val="single" w:sz="4" w:space="0" w:color="auto"/>
-              <w:left w:val="single" w:sz="4" w:space="0" w:color="auto"/>
-              <w:bottom w:val="single" w:sz="4" w:space="0" w:color="auto"/>
-              <w:right w:val="single" w:sz="4" w:space="0" w:color="auto"/>
-            </w:tcBorders>
-          </w:tcPr>
-          <w:p>
-            <w:r>
-              <w:t>PM</w:t>
-            </w:r>
-          </w:p>
-        </w:tc>
-      </w:tr>
-      <w:tr>
-        <w:tc>
-          <w:tcPr>
-            <w:tcW w:type="dxa" w:w="1234"/>
-            <w:tcBorders>
-              <w:top w:val="single" w:sz="4" w:space="0" w:color="auto"/>
-              <w:left w:val="single" w:sz="4" w:space="0" w:color="auto"/>
-              <w:bottom w:val="single" w:sz="4" w:space="0" w:color="auto"/>
-              <w:right w:val="single" w:sz="4" w:space="0" w:color="auto"/>
-            </w:tcBorders>
-          </w:tcPr>
-          <w:p>
-            <w:r>
-              <w:t>September</w:t>
-            </w:r>
-          </w:p>
-        </w:tc>
-        <w:tc>
-          <w:tcPr>
-            <w:tcW w:type="dxa" w:w="1234"/>
-            <w:tcBorders>
-              <w:top w:val="single" w:sz="4" w:space="0" w:color="auto"/>
-              <w:left w:val="single" w:sz="4" w:space="0" w:color="auto"/>
-              <w:bottom w:val="single" w:sz="4" w:space="0" w:color="auto"/>
-              <w:right w:val="single" w:sz="4" w:space="0" w:color="auto"/>
-            </w:tcBorders>
-          </w:tcPr>
-          <w:p>
-            <w:r>
-              <w:t>02</w:t>
-            </w:r>
-          </w:p>
-        </w:tc>
-        <w:tc>
-          <w:tcPr>
-            <w:tcW w:type="dxa" w:w="1234"/>
-            <w:tcBorders>
-              <w:top w:val="single" w:sz="4" w:space="0" w:color="auto"/>
-              <w:left w:val="single" w:sz="4" w:space="0" w:color="auto"/>
-              <w:bottom w:val="single" w:sz="4" w:space="0" w:color="auto"/>
-              <w:right w:val="single" w:sz="4" w:space="0" w:color="auto"/>
-            </w:tcBorders>
-          </w:tcPr>
-          <w:p>
-            <w:r>
-              <w:t>2023</w:t>
-            </w:r>
-          </w:p>
-        </w:tc>
-        <w:tc>
-          <w:tcPr>
-            <w:tcW w:type="dxa" w:w="1234"/>
-            <w:tcBorders>
-              <w:top w:val="single" w:sz="4" w:space="0" w:color="auto"/>
-              <w:left w:val="single" w:sz="4" w:space="0" w:color="auto"/>
-              <w:bottom w:val="single" w:sz="4" w:space="0" w:color="auto"/>
-              <w:right w:val="single" w:sz="4" w:space="0" w:color="auto"/>
-            </w:tcBorders>
-          </w:tcPr>
-          <w:p>
-            <w:r>
-              <w:t>09</w:t>
-            </w:r>
-          </w:p>
-        </w:tc>
-        <w:tc>
-          <w:tcPr>
-            <w:tcW w:type="dxa" w:w="1234"/>
+            <w:tcW w:type="dxa" w:w="2880"/>
             <w:tcBorders>
               <w:top w:val="single" w:sz="4" w:space="0" w:color="auto"/>
               <w:left w:val="single" w:sz="4" w:space="0" w:color="auto"/>
@@ -1570,7 +1371,7 @@
         </w:tc>
         <w:tc>
           <w:tcPr>
-            <w:tcW w:type="dxa" w:w="1234"/>
+            <w:tcW w:type="dxa" w:w="2880"/>
             <w:tcBorders>
               <w:top w:val="single" w:sz="4" w:space="0" w:color="auto"/>
               <w:left w:val="single" w:sz="4" w:space="0" w:color="auto"/>
@@ -1580,13 +1381,13 @@
           </w:tcPr>
           <w:p>
             <w:r>
-              <w:t>16</w:t>
+              <w:t>April 14, 2024</w:t>
             </w:r>
           </w:p>
         </w:tc>
         <w:tc>
           <w:tcPr>
-            <w:tcW w:type="dxa" w:w="1234"/>
+            <w:tcW w:type="dxa" w:w="2880"/>
             <w:tcBorders>
               <w:top w:val="single" w:sz="4" w:space="0" w:color="auto"/>
               <w:left w:val="single" w:sz="4" w:space="0" w:color="auto"/>
@@ -1596,7 +1397,7 @@
           </w:tcPr>
           <w:p>
             <w:r>
-              <w:t>PM</w:t>
+              <w:t>06:34:46 AM</w:t>
             </w:r>
           </w:p>
         </w:tc>
@@ -1604,299 +1405,7 @@
       <w:tr>
         <w:tc>
           <w:tcPr>
-            <w:tcW w:type="dxa" w:w="1234"/>
-            <w:tcBorders>
-              <w:top w:val="single" w:sz="4" w:space="0" w:color="auto"/>
-              <w:left w:val="single" w:sz="4" w:space="0" w:color="auto"/>
-              <w:bottom w:val="single" w:sz="4" w:space="0" w:color="auto"/>
-              <w:right w:val="single" w:sz="4" w:space="0" w:color="auto"/>
-            </w:tcBorders>
-          </w:tcPr>
-          <w:p>
-            <w:r>
-              <w:t>September</w:t>
-            </w:r>
-          </w:p>
-        </w:tc>
-        <w:tc>
-          <w:tcPr>
-            <w:tcW w:type="dxa" w:w="1234"/>
-            <w:tcBorders>
-              <w:top w:val="single" w:sz="4" w:space="0" w:color="auto"/>
-              <w:left w:val="single" w:sz="4" w:space="0" w:color="auto"/>
-              <w:bottom w:val="single" w:sz="4" w:space="0" w:color="auto"/>
-              <w:right w:val="single" w:sz="4" w:space="0" w:color="auto"/>
-            </w:tcBorders>
-          </w:tcPr>
-          <w:p>
-            <w:r>
-              <w:t>02</w:t>
-            </w:r>
-          </w:p>
-        </w:tc>
-        <w:tc>
-          <w:tcPr>
-            <w:tcW w:type="dxa" w:w="1234"/>
-            <w:tcBorders>
-              <w:top w:val="single" w:sz="4" w:space="0" w:color="auto"/>
-              <w:left w:val="single" w:sz="4" w:space="0" w:color="auto"/>
-              <w:bottom w:val="single" w:sz="4" w:space="0" w:color="auto"/>
-              <w:right w:val="single" w:sz="4" w:space="0" w:color="auto"/>
-            </w:tcBorders>
-          </w:tcPr>
-          <w:p>
-            <w:r>
-              <w:t>2023</w:t>
-            </w:r>
-          </w:p>
-        </w:tc>
-        <w:tc>
-          <w:tcPr>
-            <w:tcW w:type="dxa" w:w="1234"/>
-            <w:tcBorders>
-              <w:top w:val="single" w:sz="4" w:space="0" w:color="auto"/>
-              <w:left w:val="single" w:sz="4" w:space="0" w:color="auto"/>
-              <w:bottom w:val="single" w:sz="4" w:space="0" w:color="auto"/>
-              <w:right w:val="single" w:sz="4" w:space="0" w:color="auto"/>
-            </w:tcBorders>
-          </w:tcPr>
-          <w:p>
-            <w:r>
-              <w:t>09</w:t>
-            </w:r>
-          </w:p>
-        </w:tc>
-        <w:tc>
-          <w:tcPr>
-            <w:tcW w:type="dxa" w:w="1234"/>
-            <w:tcBorders>
-              <w:top w:val="single" w:sz="4" w:space="0" w:color="auto"/>
-              <w:left w:val="single" w:sz="4" w:space="0" w:color="auto"/>
-              <w:bottom w:val="single" w:sz="4" w:space="0" w:color="auto"/>
-              <w:right w:val="single" w:sz="4" w:space="0" w:color="auto"/>
-            </w:tcBorders>
-          </w:tcPr>
-          <w:p>
-            <w:r>
-              <w:t>25</w:t>
-            </w:r>
-          </w:p>
-        </w:tc>
-        <w:tc>
-          <w:tcPr>
-            <w:tcW w:type="dxa" w:w="1234"/>
-            <w:tcBorders>
-              <w:top w:val="single" w:sz="4" w:space="0" w:color="auto"/>
-              <w:left w:val="single" w:sz="4" w:space="0" w:color="auto"/>
-              <w:bottom w:val="single" w:sz="4" w:space="0" w:color="auto"/>
-              <w:right w:val="single" w:sz="4" w:space="0" w:color="auto"/>
-            </w:tcBorders>
-          </w:tcPr>
-          <w:p>
-            <w:r>
-              <w:t>17</w:t>
-            </w:r>
-          </w:p>
-        </w:tc>
-        <w:tc>
-          <w:tcPr>
-            <w:tcW w:type="dxa" w:w="1234"/>
-            <w:tcBorders>
-              <w:top w:val="single" w:sz="4" w:space="0" w:color="auto"/>
-              <w:left w:val="single" w:sz="4" w:space="0" w:color="auto"/>
-              <w:bottom w:val="single" w:sz="4" w:space="0" w:color="auto"/>
-              <w:right w:val="single" w:sz="4" w:space="0" w:color="auto"/>
-            </w:tcBorders>
-          </w:tcPr>
-          <w:p>
-            <w:r>
-              <w:t>PM</w:t>
-            </w:r>
-          </w:p>
-        </w:tc>
-      </w:tr>
-      <w:tr>
-        <w:tc>
-          <w:tcPr>
-            <w:tcW w:type="dxa" w:w="1234"/>
-            <w:tcBorders>
-              <w:top w:val="single" w:sz="4" w:space="0" w:color="auto"/>
-              <w:left w:val="single" w:sz="4" w:space="0" w:color="auto"/>
-              <w:bottom w:val="single" w:sz="4" w:space="0" w:color="auto"/>
-              <w:right w:val="single" w:sz="4" w:space="0" w:color="auto"/>
-            </w:tcBorders>
-          </w:tcPr>
-          <w:p>
-            <w:r>
-              <w:t>September</w:t>
-            </w:r>
-          </w:p>
-        </w:tc>
-        <w:tc>
-          <w:tcPr>
-            <w:tcW w:type="dxa" w:w="1234"/>
-            <w:tcBorders>
-              <w:top w:val="single" w:sz="4" w:space="0" w:color="auto"/>
-              <w:left w:val="single" w:sz="4" w:space="0" w:color="auto"/>
-              <w:bottom w:val="single" w:sz="4" w:space="0" w:color="auto"/>
-              <w:right w:val="single" w:sz="4" w:space="0" w:color="auto"/>
-            </w:tcBorders>
-          </w:tcPr>
-          <w:p>
-            <w:r>
-              <w:t>29</w:t>
-            </w:r>
-          </w:p>
-        </w:tc>
-        <w:tc>
-          <w:tcPr>
-            <w:tcW w:type="dxa" w:w="1234"/>
-            <w:tcBorders>
-              <w:top w:val="single" w:sz="4" w:space="0" w:color="auto"/>
-              <w:left w:val="single" w:sz="4" w:space="0" w:color="auto"/>
-              <w:bottom w:val="single" w:sz="4" w:space="0" w:color="auto"/>
-              <w:right w:val="single" w:sz="4" w:space="0" w:color="auto"/>
-            </w:tcBorders>
-          </w:tcPr>
-          <w:p>
-            <w:r>
-              <w:t>2023</w:t>
-            </w:r>
-          </w:p>
-        </w:tc>
-        <w:tc>
-          <w:tcPr>
-            <w:tcW w:type="dxa" w:w="1234"/>
-            <w:tcBorders>
-              <w:top w:val="single" w:sz="4" w:space="0" w:color="auto"/>
-              <w:left w:val="single" w:sz="4" w:space="0" w:color="auto"/>
-              <w:bottom w:val="single" w:sz="4" w:space="0" w:color="auto"/>
-              <w:right w:val="single" w:sz="4" w:space="0" w:color="auto"/>
-            </w:tcBorders>
-          </w:tcPr>
-          <w:p>
-            <w:r>
-              <w:t>04</w:t>
-            </w:r>
-          </w:p>
-        </w:tc>
-        <w:tc>
-          <w:tcPr>
-            <w:tcW w:type="dxa" w:w="1234"/>
-            <w:tcBorders>
-              <w:top w:val="single" w:sz="4" w:space="0" w:color="auto"/>
-              <w:left w:val="single" w:sz="4" w:space="0" w:color="auto"/>
-              <w:bottom w:val="single" w:sz="4" w:space="0" w:color="auto"/>
-              <w:right w:val="single" w:sz="4" w:space="0" w:color="auto"/>
-            </w:tcBorders>
-          </w:tcPr>
-          <w:p>
-            <w:r>
-              <w:t>03</w:t>
-            </w:r>
-          </w:p>
-        </w:tc>
-        <w:tc>
-          <w:tcPr>
-            <w:tcW w:type="dxa" w:w="1234"/>
-            <w:tcBorders>
-              <w:top w:val="single" w:sz="4" w:space="0" w:color="auto"/>
-              <w:left w:val="single" w:sz="4" w:space="0" w:color="auto"/>
-              <w:bottom w:val="single" w:sz="4" w:space="0" w:color="auto"/>
-              <w:right w:val="single" w:sz="4" w:space="0" w:color="auto"/>
-            </w:tcBorders>
-          </w:tcPr>
-          <w:p>
-            <w:r>
-              <w:t>46</w:t>
-            </w:r>
-          </w:p>
-        </w:tc>
-        <w:tc>
-          <w:tcPr>
-            <w:tcW w:type="dxa" w:w="1234"/>
-            <w:tcBorders>
-              <w:top w:val="single" w:sz="4" w:space="0" w:color="auto"/>
-              <w:left w:val="single" w:sz="4" w:space="0" w:color="auto"/>
-              <w:bottom w:val="single" w:sz="4" w:space="0" w:color="auto"/>
-              <w:right w:val="single" w:sz="4" w:space="0" w:color="auto"/>
-            </w:tcBorders>
-          </w:tcPr>
-          <w:p>
-            <w:r>
-              <w:t>PM</w:t>
-            </w:r>
-          </w:p>
-        </w:tc>
-      </w:tr>
-      <w:tr>
-        <w:tc>
-          <w:tcPr>
-            <w:tcW w:type="dxa" w:w="1234"/>
-            <w:tcBorders>
-              <w:top w:val="single" w:sz="4" w:space="0" w:color="auto"/>
-              <w:left w:val="single" w:sz="4" w:space="0" w:color="auto"/>
-              <w:bottom w:val="single" w:sz="4" w:space="0" w:color="auto"/>
-              <w:right w:val="single" w:sz="4" w:space="0" w:color="auto"/>
-            </w:tcBorders>
-          </w:tcPr>
-          <w:p>
-            <w:r>
-              <w:t>November</w:t>
-            </w:r>
-          </w:p>
-        </w:tc>
-        <w:tc>
-          <w:tcPr>
-            <w:tcW w:type="dxa" w:w="1234"/>
-            <w:tcBorders>
-              <w:top w:val="single" w:sz="4" w:space="0" w:color="auto"/>
-              <w:left w:val="single" w:sz="4" w:space="0" w:color="auto"/>
-              <w:bottom w:val="single" w:sz="4" w:space="0" w:color="auto"/>
-              <w:right w:val="single" w:sz="4" w:space="0" w:color="auto"/>
-            </w:tcBorders>
-          </w:tcPr>
-          <w:p>
-            <w:r>
-              <w:t>11</w:t>
-            </w:r>
-          </w:p>
-        </w:tc>
-        <w:tc>
-          <w:tcPr>
-            <w:tcW w:type="dxa" w:w="1234"/>
-            <w:tcBorders>
-              <w:top w:val="single" w:sz="4" w:space="0" w:color="auto"/>
-              <w:left w:val="single" w:sz="4" w:space="0" w:color="auto"/>
-              <w:bottom w:val="single" w:sz="4" w:space="0" w:color="auto"/>
-              <w:right w:val="single" w:sz="4" w:space="0" w:color="auto"/>
-            </w:tcBorders>
-          </w:tcPr>
-          <w:p>
-            <w:r>
-              <w:t>2023</w:t>
-            </w:r>
-          </w:p>
-        </w:tc>
-        <w:tc>
-          <w:tcPr>
-            <w:tcW w:type="dxa" w:w="1234"/>
-            <w:tcBorders>
-              <w:top w:val="single" w:sz="4" w:space="0" w:color="auto"/>
-              <w:left w:val="single" w:sz="4" w:space="0" w:color="auto"/>
-              <w:bottom w:val="single" w:sz="4" w:space="0" w:color="auto"/>
-              <w:right w:val="single" w:sz="4" w:space="0" w:color="auto"/>
-            </w:tcBorders>
-          </w:tcPr>
-          <w:p>
-            <w:r>
-              <w:t>03</w:t>
-            </w:r>
-          </w:p>
-        </w:tc>
-        <w:tc>
-          <w:tcPr>
-            <w:tcW w:type="dxa" w:w="1234"/>
+            <w:tcW w:type="dxa" w:w="2880"/>
             <w:tcBorders>
               <w:top w:val="single" w:sz="4" w:space="0" w:color="auto"/>
               <w:left w:val="single" w:sz="4" w:space="0" w:color="auto"/>
@@ -1912,7 +1421,7 @@
         </w:tc>
         <w:tc>
           <w:tcPr>
-            <w:tcW w:type="dxa" w:w="1234"/>
+            <w:tcW w:type="dxa" w:w="2880"/>
             <w:tcBorders>
               <w:top w:val="single" w:sz="4" w:space="0" w:color="auto"/>
               <w:left w:val="single" w:sz="4" w:space="0" w:color="auto"/>
@@ -1922,13 +1431,13 @@
           </w:tcPr>
           <w:p>
             <w:r>
-              <w:t>16</w:t>
+              <w:t>May 14, 2024</w:t>
             </w:r>
           </w:p>
         </w:tc>
         <w:tc>
           <w:tcPr>
-            <w:tcW w:type="dxa" w:w="1234"/>
+            <w:tcW w:type="dxa" w:w="2880"/>
             <w:tcBorders>
               <w:top w:val="single" w:sz="4" w:space="0" w:color="auto"/>
               <w:left w:val="single" w:sz="4" w:space="0" w:color="auto"/>
@@ -1938,7 +1447,7 @@
           </w:tcPr>
           <w:p>
             <w:r>
-              <w:t>AM</w:t>
+              <w:t>08:13:19 AM</w:t>
             </w:r>
           </w:p>
         </w:tc>
@@ -1946,315 +1455,7 @@
       <w:tr>
         <w:tc>
           <w:tcPr>
-            <w:tcW w:type="dxa" w:w="1234"/>
-            <w:tcBorders>
-              <w:top w:val="single" w:sz="4" w:space="0" w:color="auto"/>
-              <w:left w:val="single" w:sz="4" w:space="0" w:color="auto"/>
-              <w:bottom w:val="single" w:sz="4" w:space="0" w:color="auto"/>
-              <w:right w:val="single" w:sz="4" w:space="0" w:color="auto"/>
-            </w:tcBorders>
-          </w:tcPr>
-          <w:p>
-            <w:r>
-              <w:t>November</w:t>
-            </w:r>
-          </w:p>
-        </w:tc>
-        <w:tc>
-          <w:tcPr>
-            <w:tcW w:type="dxa" w:w="1234"/>
-            <w:tcBorders>
-              <w:top w:val="single" w:sz="4" w:space="0" w:color="auto"/>
-              <w:left w:val="single" w:sz="4" w:space="0" w:color="auto"/>
-              <w:bottom w:val="single" w:sz="4" w:space="0" w:color="auto"/>
-              <w:right w:val="single" w:sz="4" w:space="0" w:color="auto"/>
-            </w:tcBorders>
-          </w:tcPr>
-          <w:p>
-            <w:r>
-              <w:t>11</w:t>
-            </w:r>
-          </w:p>
-        </w:tc>
-        <w:tc>
-          <w:tcPr>
-            <w:tcW w:type="dxa" w:w="1234"/>
-            <w:tcBorders>
-              <w:top w:val="single" w:sz="4" w:space="0" w:color="auto"/>
-              <w:left w:val="single" w:sz="4" w:space="0" w:color="auto"/>
-              <w:bottom w:val="single" w:sz="4" w:space="0" w:color="auto"/>
-              <w:right w:val="single" w:sz="4" w:space="0" w:color="auto"/>
-            </w:tcBorders>
-          </w:tcPr>
-          <w:p>
-            <w:r>
-              <w:t>2023</w:t>
-            </w:r>
-          </w:p>
-        </w:tc>
-        <w:tc>
-          <w:tcPr>
-            <w:tcW w:type="dxa" w:w="1234"/>
-            <w:tcBorders>
-              <w:top w:val="single" w:sz="4" w:space="0" w:color="auto"/>
-              <w:left w:val="single" w:sz="4" w:space="0" w:color="auto"/>
-              <w:bottom w:val="single" w:sz="4" w:space="0" w:color="auto"/>
-              <w:right w:val="single" w:sz="4" w:space="0" w:color="auto"/>
-            </w:tcBorders>
-          </w:tcPr>
-          <w:p>
-            <w:r>
-              <w:t>03</w:t>
-            </w:r>
-          </w:p>
-        </w:tc>
-        <w:tc>
-          <w:tcPr>
-            <w:tcW w:type="dxa" w:w="1234"/>
-            <w:tcBorders>
-              <w:top w:val="single" w:sz="4" w:space="0" w:color="auto"/>
-              <w:left w:val="single" w:sz="4" w:space="0" w:color="auto"/>
-              <w:bottom w:val="single" w:sz="4" w:space="0" w:color="auto"/>
-              <w:right w:val="single" w:sz="4" w:space="0" w:color="auto"/>
-            </w:tcBorders>
-          </w:tcPr>
-          <w:p>
-            <w:r>
-              <w:t>26</w:t>
-            </w:r>
-          </w:p>
-        </w:tc>
-        <w:tc>
-          <w:tcPr>
-            <w:tcW w:type="dxa" w:w="1234"/>
-            <w:tcBorders>
-              <w:top w:val="single" w:sz="4" w:space="0" w:color="auto"/>
-              <w:left w:val="single" w:sz="4" w:space="0" w:color="auto"/>
-              <w:bottom w:val="single" w:sz="4" w:space="0" w:color="auto"/>
-              <w:right w:val="single" w:sz="4" w:space="0" w:color="auto"/>
-            </w:tcBorders>
-          </w:tcPr>
-          <w:p>
-            <w:r>
-              <w:t>17</w:t>
-            </w:r>
-          </w:p>
-        </w:tc>
-        <w:tc>
-          <w:tcPr>
-            <w:tcW w:type="dxa" w:w="1234"/>
-            <w:tcBorders>
-              <w:top w:val="single" w:sz="4" w:space="0" w:color="auto"/>
-              <w:left w:val="single" w:sz="4" w:space="0" w:color="auto"/>
-              <w:bottom w:val="single" w:sz="4" w:space="0" w:color="auto"/>
-              <w:right w:val="single" w:sz="4" w:space="0" w:color="auto"/>
-            </w:tcBorders>
-          </w:tcPr>
-          <w:p>
-            <w:r>
-              <w:t>AM</w:t>
-            </w:r>
-          </w:p>
-        </w:tc>
-      </w:tr>
-      <w:tr>
-        <w:tc>
-          <w:tcPr>
-            <w:tcW w:type="dxa" w:w="1234"/>
-            <w:tcBorders>
-              <w:top w:val="single" w:sz="4" w:space="0" w:color="auto"/>
-              <w:left w:val="single" w:sz="4" w:space="0" w:color="auto"/>
-              <w:bottom w:val="single" w:sz="4" w:space="0" w:color="auto"/>
-              <w:right w:val="single" w:sz="4" w:space="0" w:color="auto"/>
-            </w:tcBorders>
-          </w:tcPr>
-          <w:p>
-            <w:r>
-              <w:t>December</w:t>
-            </w:r>
-          </w:p>
-        </w:tc>
-        <w:tc>
-          <w:tcPr>
-            <w:tcW w:type="dxa" w:w="1234"/>
-            <w:tcBorders>
-              <w:top w:val="single" w:sz="4" w:space="0" w:color="auto"/>
-              <w:left w:val="single" w:sz="4" w:space="0" w:color="auto"/>
-              <w:bottom w:val="single" w:sz="4" w:space="0" w:color="auto"/>
-              <w:right w:val="single" w:sz="4" w:space="0" w:color="auto"/>
-            </w:tcBorders>
-          </w:tcPr>
-          <w:p>
-            <w:r>
-              <w:t>08</w:t>
-            </w:r>
-          </w:p>
-        </w:tc>
-        <w:tc>
-          <w:tcPr>
-            <w:tcW w:type="dxa" w:w="1234"/>
-            <w:tcBorders>
-              <w:top w:val="single" w:sz="4" w:space="0" w:color="auto"/>
-              <w:left w:val="single" w:sz="4" w:space="0" w:color="auto"/>
-              <w:bottom w:val="single" w:sz="4" w:space="0" w:color="auto"/>
-              <w:right w:val="single" w:sz="4" w:space="0" w:color="auto"/>
-            </w:tcBorders>
-          </w:tcPr>
-          <w:p>
-            <w:r>
-              <w:t>2023</w:t>
-            </w:r>
-          </w:p>
-        </w:tc>
-        <w:tc>
-          <w:tcPr>
-            <w:tcW w:type="dxa" w:w="1234"/>
-            <w:tcBorders>
-              <w:top w:val="single" w:sz="4" w:space="0" w:color="auto"/>
-              <w:left w:val="single" w:sz="4" w:space="0" w:color="auto"/>
-              <w:bottom w:val="single" w:sz="4" w:space="0" w:color="auto"/>
-              <w:right w:val="single" w:sz="4" w:space="0" w:color="auto"/>
-            </w:tcBorders>
-          </w:tcPr>
-          <w:p>
-            <w:r>
-              <w:t>06</w:t>
-            </w:r>
-          </w:p>
-        </w:tc>
-        <w:tc>
-          <w:tcPr>
-            <w:tcW w:type="dxa" w:w="1234"/>
-            <w:tcBorders>
-              <w:top w:val="single" w:sz="4" w:space="0" w:color="auto"/>
-              <w:left w:val="single" w:sz="4" w:space="0" w:color="auto"/>
-              <w:bottom w:val="single" w:sz="4" w:space="0" w:color="auto"/>
-              <w:right w:val="single" w:sz="4" w:space="0" w:color="auto"/>
-            </w:tcBorders>
-          </w:tcPr>
-          <w:p>
-            <w:r>
-              <w:t>23</w:t>
-            </w:r>
-          </w:p>
-        </w:tc>
-        <w:tc>
-          <w:tcPr>
-            <w:tcW w:type="dxa" w:w="1234"/>
-            <w:tcBorders>
-              <w:top w:val="single" w:sz="4" w:space="0" w:color="auto"/>
-              <w:left w:val="single" w:sz="4" w:space="0" w:color="auto"/>
-              <w:bottom w:val="single" w:sz="4" w:space="0" w:color="auto"/>
-              <w:right w:val="single" w:sz="4" w:space="0" w:color="auto"/>
-            </w:tcBorders>
-          </w:tcPr>
-          <w:p>
-            <w:r>
-              <w:t>16</w:t>
-            </w:r>
-          </w:p>
-        </w:tc>
-        <w:tc>
-          <w:tcPr>
-            <w:tcW w:type="dxa" w:w="1234"/>
-            <w:tcBorders>
-              <w:top w:val="single" w:sz="4" w:space="0" w:color="auto"/>
-              <w:left w:val="single" w:sz="4" w:space="0" w:color="auto"/>
-              <w:bottom w:val="single" w:sz="4" w:space="0" w:color="auto"/>
-              <w:right w:val="single" w:sz="4" w:space="0" w:color="auto"/>
-            </w:tcBorders>
-          </w:tcPr>
-          <w:p>
-            <w:r>
-              <w:t>AM</w:t>
-            </w:r>
-          </w:p>
-        </w:tc>
-      </w:tr>
-      <w:tr>
-        <w:tc>
-          <w:tcPr>
-            <w:tcW w:type="dxa" w:w="1234"/>
-            <w:tcBorders>
-              <w:top w:val="single" w:sz="4" w:space="0" w:color="auto"/>
-              <w:left w:val="single" w:sz="4" w:space="0" w:color="auto"/>
-              <w:bottom w:val="single" w:sz="4" w:space="0" w:color="auto"/>
-              <w:right w:val="single" w:sz="4" w:space="0" w:color="auto"/>
-            </w:tcBorders>
-          </w:tcPr>
-          <w:p>
-            <w:r>
-              <w:t>December</w:t>
-            </w:r>
-          </w:p>
-        </w:tc>
-        <w:tc>
-          <w:tcPr>
-            <w:tcW w:type="dxa" w:w="1234"/>
-            <w:tcBorders>
-              <w:top w:val="single" w:sz="4" w:space="0" w:color="auto"/>
-              <w:left w:val="single" w:sz="4" w:space="0" w:color="auto"/>
-              <w:bottom w:val="single" w:sz="4" w:space="0" w:color="auto"/>
-              <w:right w:val="single" w:sz="4" w:space="0" w:color="auto"/>
-            </w:tcBorders>
-          </w:tcPr>
-          <w:p>
-            <w:r>
-              <w:t>09</w:t>
-            </w:r>
-          </w:p>
-        </w:tc>
-        <w:tc>
-          <w:tcPr>
-            <w:tcW w:type="dxa" w:w="1234"/>
-            <w:tcBorders>
-              <w:top w:val="single" w:sz="4" w:space="0" w:color="auto"/>
-              <w:left w:val="single" w:sz="4" w:space="0" w:color="auto"/>
-              <w:bottom w:val="single" w:sz="4" w:space="0" w:color="auto"/>
-              <w:right w:val="single" w:sz="4" w:space="0" w:color="auto"/>
-            </w:tcBorders>
-          </w:tcPr>
-          <w:p>
-            <w:r>
-              <w:t>2023</w:t>
-            </w:r>
-          </w:p>
-        </w:tc>
-        <w:tc>
-          <w:tcPr>
-            <w:tcW w:type="dxa" w:w="1234"/>
-            <w:tcBorders>
-              <w:top w:val="single" w:sz="4" w:space="0" w:color="auto"/>
-              <w:left w:val="single" w:sz="4" w:space="0" w:color="auto"/>
-              <w:bottom w:val="single" w:sz="4" w:space="0" w:color="auto"/>
-              <w:right w:val="single" w:sz="4" w:space="0" w:color="auto"/>
-            </w:tcBorders>
-          </w:tcPr>
-          <w:p>
-            <w:r>
-              <w:t>02</w:t>
-            </w:r>
-          </w:p>
-        </w:tc>
-        <w:tc>
-          <w:tcPr>
-            <w:tcW w:type="dxa" w:w="1234"/>
-            <w:tcBorders>
-              <w:top w:val="single" w:sz="4" w:space="0" w:color="auto"/>
-              <w:left w:val="single" w:sz="4" w:space="0" w:color="auto"/>
-              <w:bottom w:val="single" w:sz="4" w:space="0" w:color="auto"/>
-              <w:right w:val="single" w:sz="4" w:space="0" w:color="auto"/>
-            </w:tcBorders>
-          </w:tcPr>
-          <w:p>
-            <w:r>
-              <w:t>05</w:t>
-            </w:r>
-          </w:p>
-        </w:tc>
-        <w:tc>
-          <w:tcPr>
-            <w:tcW w:type="dxa" w:w="1234"/>
+            <w:tcW w:type="dxa" w:w="2880"/>
             <w:tcBorders>
               <w:top w:val="single" w:sz="4" w:space="0" w:color="auto"/>
               <w:left w:val="single" w:sz="4" w:space="0" w:color="auto"/>
@@ -2270,7 +1471,7 @@
         </w:tc>
         <w:tc>
           <w:tcPr>
-            <w:tcW w:type="dxa" w:w="1234"/>
+            <w:tcW w:type="dxa" w:w="2880"/>
             <w:tcBorders>
               <w:top w:val="single" w:sz="4" w:space="0" w:color="auto"/>
               <w:left w:val="single" w:sz="4" w:space="0" w:color="auto"/>
@@ -2280,15 +1481,13 @@
           </w:tcPr>
           <w:p>
             <w:r>
-              <w:t>PM</w:t>
+              <w:t>June 13, 2024</w:t>
             </w:r>
           </w:p>
         </w:tc>
-      </w:tr>
-      <w:tr>
         <w:tc>
           <w:tcPr>
-            <w:tcW w:type="dxa" w:w="1234"/>
+            <w:tcW w:type="dxa" w:w="2880"/>
             <w:tcBorders>
               <w:top w:val="single" w:sz="4" w:space="0" w:color="auto"/>
               <w:left w:val="single" w:sz="4" w:space="0" w:color="auto"/>
@@ -2298,1015 +1497,7 @@
           </w:tcPr>
           <w:p>
             <w:r>
-              <w:t>December</w:t>
-            </w:r>
-          </w:p>
-        </w:tc>
-        <w:tc>
-          <w:tcPr>
-            <w:tcW w:type="dxa" w:w="1234"/>
-            <w:tcBorders>
-              <w:top w:val="single" w:sz="4" w:space="0" w:color="auto"/>
-              <w:left w:val="single" w:sz="4" w:space="0" w:color="auto"/>
-              <w:bottom w:val="single" w:sz="4" w:space="0" w:color="auto"/>
-              <w:right w:val="single" w:sz="4" w:space="0" w:color="auto"/>
-            </w:tcBorders>
-          </w:tcPr>
-          <w:p>
-            <w:r>
-              <w:t>25</w:t>
-            </w:r>
-          </w:p>
-        </w:tc>
-        <w:tc>
-          <w:tcPr>
-            <w:tcW w:type="dxa" w:w="1234"/>
-            <w:tcBorders>
-              <w:top w:val="single" w:sz="4" w:space="0" w:color="auto"/>
-              <w:left w:val="single" w:sz="4" w:space="0" w:color="auto"/>
-              <w:bottom w:val="single" w:sz="4" w:space="0" w:color="auto"/>
-              <w:right w:val="single" w:sz="4" w:space="0" w:color="auto"/>
-            </w:tcBorders>
-          </w:tcPr>
-          <w:p>
-            <w:r>
-              <w:t>2023</w:t>
-            </w:r>
-          </w:p>
-        </w:tc>
-        <w:tc>
-          <w:tcPr>
-            <w:tcW w:type="dxa" w:w="1234"/>
-            <w:tcBorders>
-              <w:top w:val="single" w:sz="4" w:space="0" w:color="auto"/>
-              <w:left w:val="single" w:sz="4" w:space="0" w:color="auto"/>
-              <w:bottom w:val="single" w:sz="4" w:space="0" w:color="auto"/>
-              <w:right w:val="single" w:sz="4" w:space="0" w:color="auto"/>
-            </w:tcBorders>
-          </w:tcPr>
-          <w:p>
-            <w:r>
-              <w:t>05</w:t>
-            </w:r>
-          </w:p>
-        </w:tc>
-        <w:tc>
-          <w:tcPr>
-            <w:tcW w:type="dxa" w:w="1234"/>
-            <w:tcBorders>
-              <w:top w:val="single" w:sz="4" w:space="0" w:color="auto"/>
-              <w:left w:val="single" w:sz="4" w:space="0" w:color="auto"/>
-              <w:bottom w:val="single" w:sz="4" w:space="0" w:color="auto"/>
-              <w:right w:val="single" w:sz="4" w:space="0" w:color="auto"/>
-            </w:tcBorders>
-          </w:tcPr>
-          <w:p>
-            <w:r>
-              <w:t>43</w:t>
-            </w:r>
-          </w:p>
-        </w:tc>
-        <w:tc>
-          <w:tcPr>
-            <w:tcW w:type="dxa" w:w="1234"/>
-            <w:tcBorders>
-              <w:top w:val="single" w:sz="4" w:space="0" w:color="auto"/>
-              <w:left w:val="single" w:sz="4" w:space="0" w:color="auto"/>
-              <w:bottom w:val="single" w:sz="4" w:space="0" w:color="auto"/>
-              <w:right w:val="single" w:sz="4" w:space="0" w:color="auto"/>
-            </w:tcBorders>
-          </w:tcPr>
-          <w:p>
-            <w:r>
-              <w:t>41</w:t>
-            </w:r>
-          </w:p>
-        </w:tc>
-        <w:tc>
-          <w:tcPr>
-            <w:tcW w:type="dxa" w:w="1234"/>
-            <w:tcBorders>
-              <w:top w:val="single" w:sz="4" w:space="0" w:color="auto"/>
-              <w:left w:val="single" w:sz="4" w:space="0" w:color="auto"/>
-              <w:bottom w:val="single" w:sz="4" w:space="0" w:color="auto"/>
-              <w:right w:val="single" w:sz="4" w:space="0" w:color="auto"/>
-            </w:tcBorders>
-          </w:tcPr>
-          <w:p>
-            <w:r>
-              <w:t>PM</w:t>
-            </w:r>
-          </w:p>
-        </w:tc>
-      </w:tr>
-      <w:tr>
-        <w:tc>
-          <w:tcPr>
-            <w:tcW w:type="dxa" w:w="1234"/>
-            <w:tcBorders>
-              <w:top w:val="single" w:sz="4" w:space="0" w:color="auto"/>
-              <w:left w:val="single" w:sz="4" w:space="0" w:color="auto"/>
-              <w:bottom w:val="single" w:sz="4" w:space="0" w:color="auto"/>
-              <w:right w:val="single" w:sz="4" w:space="0" w:color="auto"/>
-            </w:tcBorders>
-          </w:tcPr>
-          <w:p>
-            <w:r>
-              <w:t>January</w:t>
-            </w:r>
-          </w:p>
-        </w:tc>
-        <w:tc>
-          <w:tcPr>
-            <w:tcW w:type="dxa" w:w="1234"/>
-            <w:tcBorders>
-              <w:top w:val="single" w:sz="4" w:space="0" w:color="auto"/>
-              <w:left w:val="single" w:sz="4" w:space="0" w:color="auto"/>
-              <w:bottom w:val="single" w:sz="4" w:space="0" w:color="auto"/>
-              <w:right w:val="single" w:sz="4" w:space="0" w:color="auto"/>
-            </w:tcBorders>
-          </w:tcPr>
-          <w:p>
-            <w:r>
-              <w:t>31</w:t>
-            </w:r>
-          </w:p>
-        </w:tc>
-        <w:tc>
-          <w:tcPr>
-            <w:tcW w:type="dxa" w:w="1234"/>
-            <w:tcBorders>
-              <w:top w:val="single" w:sz="4" w:space="0" w:color="auto"/>
-              <w:left w:val="single" w:sz="4" w:space="0" w:color="auto"/>
-              <w:bottom w:val="single" w:sz="4" w:space="0" w:color="auto"/>
-              <w:right w:val="single" w:sz="4" w:space="0" w:color="auto"/>
-            </w:tcBorders>
-          </w:tcPr>
-          <w:p>
-            <w:r>
-              <w:t>2024</w:t>
-            </w:r>
-          </w:p>
-        </w:tc>
-        <w:tc>
-          <w:tcPr>
-            <w:tcW w:type="dxa" w:w="1234"/>
-            <w:tcBorders>
-              <w:top w:val="single" w:sz="4" w:space="0" w:color="auto"/>
-              <w:left w:val="single" w:sz="4" w:space="0" w:color="auto"/>
-              <w:bottom w:val="single" w:sz="4" w:space="0" w:color="auto"/>
-              <w:right w:val="single" w:sz="4" w:space="0" w:color="auto"/>
-            </w:tcBorders>
-          </w:tcPr>
-          <w:p>
-            <w:r>
-              <w:t>11</w:t>
-            </w:r>
-          </w:p>
-        </w:tc>
-        <w:tc>
-          <w:tcPr>
-            <w:tcW w:type="dxa" w:w="1234"/>
-            <w:tcBorders>
-              <w:top w:val="single" w:sz="4" w:space="0" w:color="auto"/>
-              <w:left w:val="single" w:sz="4" w:space="0" w:color="auto"/>
-              <w:bottom w:val="single" w:sz="4" w:space="0" w:color="auto"/>
-              <w:right w:val="single" w:sz="4" w:space="0" w:color="auto"/>
-            </w:tcBorders>
-          </w:tcPr>
-          <w:p>
-            <w:r>
-              <w:t>29</w:t>
-            </w:r>
-          </w:p>
-        </w:tc>
-        <w:tc>
-          <w:tcPr>
-            <w:tcW w:type="dxa" w:w="1234"/>
-            <w:tcBorders>
-              <w:top w:val="single" w:sz="4" w:space="0" w:color="auto"/>
-              <w:left w:val="single" w:sz="4" w:space="0" w:color="auto"/>
-              <w:bottom w:val="single" w:sz="4" w:space="0" w:color="auto"/>
-              <w:right w:val="single" w:sz="4" w:space="0" w:color="auto"/>
-            </w:tcBorders>
-          </w:tcPr>
-          <w:p>
-            <w:r>
-              <w:t>05</w:t>
-            </w:r>
-          </w:p>
-        </w:tc>
-        <w:tc>
-          <w:tcPr>
-            <w:tcW w:type="dxa" w:w="1234"/>
-            <w:tcBorders>
-              <w:top w:val="single" w:sz="4" w:space="0" w:color="auto"/>
-              <w:left w:val="single" w:sz="4" w:space="0" w:color="auto"/>
-              <w:bottom w:val="single" w:sz="4" w:space="0" w:color="auto"/>
-              <w:right w:val="single" w:sz="4" w:space="0" w:color="auto"/>
-            </w:tcBorders>
-          </w:tcPr>
-          <w:p>
-            <w:r>
-              <w:t>AM</w:t>
-            </w:r>
-          </w:p>
-        </w:tc>
-      </w:tr>
-      <w:tr>
-        <w:tc>
-          <w:tcPr>
-            <w:tcW w:type="dxa" w:w="1234"/>
-            <w:tcBorders>
-              <w:top w:val="single" w:sz="4" w:space="0" w:color="auto"/>
-              <w:left w:val="single" w:sz="4" w:space="0" w:color="auto"/>
-              <w:bottom w:val="single" w:sz="4" w:space="0" w:color="auto"/>
-              <w:right w:val="single" w:sz="4" w:space="0" w:color="auto"/>
-            </w:tcBorders>
-          </w:tcPr>
-          <w:p>
-            <w:r>
-              <w:t>February</w:t>
-            </w:r>
-          </w:p>
-        </w:tc>
-        <w:tc>
-          <w:tcPr>
-            <w:tcW w:type="dxa" w:w="1234"/>
-            <w:tcBorders>
-              <w:top w:val="single" w:sz="4" w:space="0" w:color="auto"/>
-              <w:left w:val="single" w:sz="4" w:space="0" w:color="auto"/>
-              <w:bottom w:val="single" w:sz="4" w:space="0" w:color="auto"/>
-              <w:right w:val="single" w:sz="4" w:space="0" w:color="auto"/>
-            </w:tcBorders>
-          </w:tcPr>
-          <w:p>
-            <w:r>
-              <w:t>09</w:t>
-            </w:r>
-          </w:p>
-        </w:tc>
-        <w:tc>
-          <w:tcPr>
-            <w:tcW w:type="dxa" w:w="1234"/>
-            <w:tcBorders>
-              <w:top w:val="single" w:sz="4" w:space="0" w:color="auto"/>
-              <w:left w:val="single" w:sz="4" w:space="0" w:color="auto"/>
-              <w:bottom w:val="single" w:sz="4" w:space="0" w:color="auto"/>
-              <w:right w:val="single" w:sz="4" w:space="0" w:color="auto"/>
-            </w:tcBorders>
-          </w:tcPr>
-          <w:p>
-            <w:r>
-              <w:t>2024</w:t>
-            </w:r>
-          </w:p>
-        </w:tc>
-        <w:tc>
-          <w:tcPr>
-            <w:tcW w:type="dxa" w:w="1234"/>
-            <w:tcBorders>
-              <w:top w:val="single" w:sz="4" w:space="0" w:color="auto"/>
-              <w:left w:val="single" w:sz="4" w:space="0" w:color="auto"/>
-              <w:bottom w:val="single" w:sz="4" w:space="0" w:color="auto"/>
-              <w:right w:val="single" w:sz="4" w:space="0" w:color="auto"/>
-            </w:tcBorders>
-          </w:tcPr>
-          <w:p>
-            <w:r>
-              <w:t>05</w:t>
-            </w:r>
-          </w:p>
-        </w:tc>
-        <w:tc>
-          <w:tcPr>
-            <w:tcW w:type="dxa" w:w="1234"/>
-            <w:tcBorders>
-              <w:top w:val="single" w:sz="4" w:space="0" w:color="auto"/>
-              <w:left w:val="single" w:sz="4" w:space="0" w:color="auto"/>
-              <w:bottom w:val="single" w:sz="4" w:space="0" w:color="auto"/>
-              <w:right w:val="single" w:sz="4" w:space="0" w:color="auto"/>
-            </w:tcBorders>
-          </w:tcPr>
-          <w:p>
-            <w:r>
-              <w:t>45</w:t>
-            </w:r>
-          </w:p>
-        </w:tc>
-        <w:tc>
-          <w:tcPr>
-            <w:tcW w:type="dxa" w:w="1234"/>
-            <w:tcBorders>
-              <w:top w:val="single" w:sz="4" w:space="0" w:color="auto"/>
-              <w:left w:val="single" w:sz="4" w:space="0" w:color="auto"/>
-              <w:bottom w:val="single" w:sz="4" w:space="0" w:color="auto"/>
-              <w:right w:val="single" w:sz="4" w:space="0" w:color="auto"/>
-            </w:tcBorders>
-          </w:tcPr>
-          <w:p>
-            <w:r>
-              <w:t>37</w:t>
-            </w:r>
-          </w:p>
-        </w:tc>
-        <w:tc>
-          <w:tcPr>
-            <w:tcW w:type="dxa" w:w="1234"/>
-            <w:tcBorders>
-              <w:top w:val="single" w:sz="4" w:space="0" w:color="auto"/>
-              <w:left w:val="single" w:sz="4" w:space="0" w:color="auto"/>
-              <w:bottom w:val="single" w:sz="4" w:space="0" w:color="auto"/>
-              <w:right w:val="single" w:sz="4" w:space="0" w:color="auto"/>
-            </w:tcBorders>
-          </w:tcPr>
-          <w:p>
-            <w:r>
-              <w:t>PM</w:t>
-            </w:r>
-          </w:p>
-        </w:tc>
-      </w:tr>
-      <w:tr>
-        <w:tc>
-          <w:tcPr>
-            <w:tcW w:type="dxa" w:w="1234"/>
-            <w:tcBorders>
-              <w:top w:val="single" w:sz="4" w:space="0" w:color="auto"/>
-              <w:left w:val="single" w:sz="4" w:space="0" w:color="auto"/>
-              <w:bottom w:val="single" w:sz="4" w:space="0" w:color="auto"/>
-              <w:right w:val="single" w:sz="4" w:space="0" w:color="auto"/>
-            </w:tcBorders>
-          </w:tcPr>
-          <w:p>
-            <w:r>
-              <w:t>February</w:t>
-            </w:r>
-          </w:p>
-        </w:tc>
-        <w:tc>
-          <w:tcPr>
-            <w:tcW w:type="dxa" w:w="1234"/>
-            <w:tcBorders>
-              <w:top w:val="single" w:sz="4" w:space="0" w:color="auto"/>
-              <w:left w:val="single" w:sz="4" w:space="0" w:color="auto"/>
-              <w:bottom w:val="single" w:sz="4" w:space="0" w:color="auto"/>
-              <w:right w:val="single" w:sz="4" w:space="0" w:color="auto"/>
-            </w:tcBorders>
-          </w:tcPr>
-          <w:p>
-            <w:r>
-              <w:t>16</w:t>
-            </w:r>
-          </w:p>
-        </w:tc>
-        <w:tc>
-          <w:tcPr>
-            <w:tcW w:type="dxa" w:w="1234"/>
-            <w:tcBorders>
-              <w:top w:val="single" w:sz="4" w:space="0" w:color="auto"/>
-              <w:left w:val="single" w:sz="4" w:space="0" w:color="auto"/>
-              <w:bottom w:val="single" w:sz="4" w:space="0" w:color="auto"/>
-              <w:right w:val="single" w:sz="4" w:space="0" w:color="auto"/>
-            </w:tcBorders>
-          </w:tcPr>
-          <w:p>
-            <w:r>
-              <w:t>2024</w:t>
-            </w:r>
-          </w:p>
-        </w:tc>
-        <w:tc>
-          <w:tcPr>
-            <w:tcW w:type="dxa" w:w="1234"/>
-            <w:tcBorders>
-              <w:top w:val="single" w:sz="4" w:space="0" w:color="auto"/>
-              <w:left w:val="single" w:sz="4" w:space="0" w:color="auto"/>
-              <w:bottom w:val="single" w:sz="4" w:space="0" w:color="auto"/>
-              <w:right w:val="single" w:sz="4" w:space="0" w:color="auto"/>
-            </w:tcBorders>
-          </w:tcPr>
-          <w:p>
-            <w:r>
-              <w:t>04</w:t>
-            </w:r>
-          </w:p>
-        </w:tc>
-        <w:tc>
-          <w:tcPr>
-            <w:tcW w:type="dxa" w:w="1234"/>
-            <w:tcBorders>
-              <w:top w:val="single" w:sz="4" w:space="0" w:color="auto"/>
-              <w:left w:val="single" w:sz="4" w:space="0" w:color="auto"/>
-              <w:bottom w:val="single" w:sz="4" w:space="0" w:color="auto"/>
-              <w:right w:val="single" w:sz="4" w:space="0" w:color="auto"/>
-            </w:tcBorders>
-          </w:tcPr>
-          <w:p>
-            <w:r>
-              <w:t>19</w:t>
-            </w:r>
-          </w:p>
-        </w:tc>
-        <w:tc>
-          <w:tcPr>
-            <w:tcW w:type="dxa" w:w="1234"/>
-            <w:tcBorders>
-              <w:top w:val="single" w:sz="4" w:space="0" w:color="auto"/>
-              <w:left w:val="single" w:sz="4" w:space="0" w:color="auto"/>
-              <w:bottom w:val="single" w:sz="4" w:space="0" w:color="auto"/>
-              <w:right w:val="single" w:sz="4" w:space="0" w:color="auto"/>
-            </w:tcBorders>
-          </w:tcPr>
-          <w:p>
-            <w:r>
-              <w:t>01</w:t>
-            </w:r>
-          </w:p>
-        </w:tc>
-        <w:tc>
-          <w:tcPr>
-            <w:tcW w:type="dxa" w:w="1234"/>
-            <w:tcBorders>
-              <w:top w:val="single" w:sz="4" w:space="0" w:color="auto"/>
-              <w:left w:val="single" w:sz="4" w:space="0" w:color="auto"/>
-              <w:bottom w:val="single" w:sz="4" w:space="0" w:color="auto"/>
-              <w:right w:val="single" w:sz="4" w:space="0" w:color="auto"/>
-            </w:tcBorders>
-          </w:tcPr>
-          <w:p>
-            <w:r>
-              <w:t>AM</w:t>
-            </w:r>
-          </w:p>
-        </w:tc>
-      </w:tr>
-      <w:tr>
-        <w:tc>
-          <w:tcPr>
-            <w:tcW w:type="dxa" w:w="1234"/>
-            <w:tcBorders>
-              <w:top w:val="single" w:sz="4" w:space="0" w:color="auto"/>
-              <w:left w:val="single" w:sz="4" w:space="0" w:color="auto"/>
-              <w:bottom w:val="single" w:sz="4" w:space="0" w:color="auto"/>
-              <w:right w:val="single" w:sz="4" w:space="0" w:color="auto"/>
-            </w:tcBorders>
-          </w:tcPr>
-          <w:p>
-            <w:r>
-              <w:t>February</w:t>
-            </w:r>
-          </w:p>
-        </w:tc>
-        <w:tc>
-          <w:tcPr>
-            <w:tcW w:type="dxa" w:w="1234"/>
-            <w:tcBorders>
-              <w:top w:val="single" w:sz="4" w:space="0" w:color="auto"/>
-              <w:left w:val="single" w:sz="4" w:space="0" w:color="auto"/>
-              <w:bottom w:val="single" w:sz="4" w:space="0" w:color="auto"/>
-              <w:right w:val="single" w:sz="4" w:space="0" w:color="auto"/>
-            </w:tcBorders>
-          </w:tcPr>
-          <w:p>
-            <w:r>
-              <w:t>28</w:t>
-            </w:r>
-          </w:p>
-        </w:tc>
-        <w:tc>
-          <w:tcPr>
-            <w:tcW w:type="dxa" w:w="1234"/>
-            <w:tcBorders>
-              <w:top w:val="single" w:sz="4" w:space="0" w:color="auto"/>
-              <w:left w:val="single" w:sz="4" w:space="0" w:color="auto"/>
-              <w:bottom w:val="single" w:sz="4" w:space="0" w:color="auto"/>
-              <w:right w:val="single" w:sz="4" w:space="0" w:color="auto"/>
-            </w:tcBorders>
-          </w:tcPr>
-          <w:p>
-            <w:r>
-              <w:t>2024</w:t>
-            </w:r>
-          </w:p>
-        </w:tc>
-        <w:tc>
-          <w:tcPr>
-            <w:tcW w:type="dxa" w:w="1234"/>
-            <w:tcBorders>
-              <w:top w:val="single" w:sz="4" w:space="0" w:color="auto"/>
-              <w:left w:val="single" w:sz="4" w:space="0" w:color="auto"/>
-              <w:bottom w:val="single" w:sz="4" w:space="0" w:color="auto"/>
-              <w:right w:val="single" w:sz="4" w:space="0" w:color="auto"/>
-            </w:tcBorders>
-          </w:tcPr>
-          <w:p>
-            <w:r>
-              <w:t>08</w:t>
-            </w:r>
-          </w:p>
-        </w:tc>
-        <w:tc>
-          <w:tcPr>
-            <w:tcW w:type="dxa" w:w="1234"/>
-            <w:tcBorders>
-              <w:top w:val="single" w:sz="4" w:space="0" w:color="auto"/>
-              <w:left w:val="single" w:sz="4" w:space="0" w:color="auto"/>
-              <w:bottom w:val="single" w:sz="4" w:space="0" w:color="auto"/>
-              <w:right w:val="single" w:sz="4" w:space="0" w:color="auto"/>
-            </w:tcBorders>
-          </w:tcPr>
-          <w:p>
-            <w:r>
-              <w:t>30</w:t>
-            </w:r>
-          </w:p>
-        </w:tc>
-        <w:tc>
-          <w:tcPr>
-            <w:tcW w:type="dxa" w:w="1234"/>
-            <w:tcBorders>
-              <w:top w:val="single" w:sz="4" w:space="0" w:color="auto"/>
-              <w:left w:val="single" w:sz="4" w:space="0" w:color="auto"/>
-              <w:bottom w:val="single" w:sz="4" w:space="0" w:color="auto"/>
-              <w:right w:val="single" w:sz="4" w:space="0" w:color="auto"/>
-            </w:tcBorders>
-          </w:tcPr>
-          <w:p>
-            <w:r>
-              <w:t>23</w:t>
-            </w:r>
-          </w:p>
-        </w:tc>
-        <w:tc>
-          <w:tcPr>
-            <w:tcW w:type="dxa" w:w="1234"/>
-            <w:tcBorders>
-              <w:top w:val="single" w:sz="4" w:space="0" w:color="auto"/>
-              <w:left w:val="single" w:sz="4" w:space="0" w:color="auto"/>
-              <w:bottom w:val="single" w:sz="4" w:space="0" w:color="auto"/>
-              <w:right w:val="single" w:sz="4" w:space="0" w:color="auto"/>
-            </w:tcBorders>
-          </w:tcPr>
-          <w:p>
-            <w:r>
-              <w:t>AM</w:t>
-            </w:r>
-          </w:p>
-        </w:tc>
-      </w:tr>
-      <w:tr>
-        <w:tc>
-          <w:tcPr>
-            <w:tcW w:type="dxa" w:w="1234"/>
-            <w:tcBorders>
-              <w:top w:val="single" w:sz="4" w:space="0" w:color="auto"/>
-              <w:left w:val="single" w:sz="4" w:space="0" w:color="auto"/>
-              <w:bottom w:val="single" w:sz="4" w:space="0" w:color="auto"/>
-              <w:right w:val="single" w:sz="4" w:space="0" w:color="auto"/>
-            </w:tcBorders>
-          </w:tcPr>
-          <w:p>
-            <w:r>
-              <w:t>March</w:t>
-            </w:r>
-          </w:p>
-        </w:tc>
-        <w:tc>
-          <w:tcPr>
-            <w:tcW w:type="dxa" w:w="1234"/>
-            <w:tcBorders>
-              <w:top w:val="single" w:sz="4" w:space="0" w:color="auto"/>
-              <w:left w:val="single" w:sz="4" w:space="0" w:color="auto"/>
-              <w:bottom w:val="single" w:sz="4" w:space="0" w:color="auto"/>
-              <w:right w:val="single" w:sz="4" w:space="0" w:color="auto"/>
-            </w:tcBorders>
-          </w:tcPr>
-          <w:p>
-            <w:r>
-              <w:t>15</w:t>
-            </w:r>
-          </w:p>
-        </w:tc>
-        <w:tc>
-          <w:tcPr>
-            <w:tcW w:type="dxa" w:w="1234"/>
-            <w:tcBorders>
-              <w:top w:val="single" w:sz="4" w:space="0" w:color="auto"/>
-              <w:left w:val="single" w:sz="4" w:space="0" w:color="auto"/>
-              <w:bottom w:val="single" w:sz="4" w:space="0" w:color="auto"/>
-              <w:right w:val="single" w:sz="4" w:space="0" w:color="auto"/>
-            </w:tcBorders>
-          </w:tcPr>
-          <w:p>
-            <w:r>
-              <w:t>2024</w:t>
-            </w:r>
-          </w:p>
-        </w:tc>
-        <w:tc>
-          <w:tcPr>
-            <w:tcW w:type="dxa" w:w="1234"/>
-            <w:tcBorders>
-              <w:top w:val="single" w:sz="4" w:space="0" w:color="auto"/>
-              <w:left w:val="single" w:sz="4" w:space="0" w:color="auto"/>
-              <w:bottom w:val="single" w:sz="4" w:space="0" w:color="auto"/>
-              <w:right w:val="single" w:sz="4" w:space="0" w:color="auto"/>
-            </w:tcBorders>
-          </w:tcPr>
-          <w:p>
-            <w:r>
-              <w:t>09</w:t>
-            </w:r>
-          </w:p>
-        </w:tc>
-        <w:tc>
-          <w:tcPr>
-            <w:tcW w:type="dxa" w:w="1234"/>
-            <w:tcBorders>
-              <w:top w:val="single" w:sz="4" w:space="0" w:color="auto"/>
-              <w:left w:val="single" w:sz="4" w:space="0" w:color="auto"/>
-              <w:bottom w:val="single" w:sz="4" w:space="0" w:color="auto"/>
-              <w:right w:val="single" w:sz="4" w:space="0" w:color="auto"/>
-            </w:tcBorders>
-          </w:tcPr>
-          <w:p>
-            <w:r>
-              <w:t>15</w:t>
-            </w:r>
-          </w:p>
-        </w:tc>
-        <w:tc>
-          <w:tcPr>
-            <w:tcW w:type="dxa" w:w="1234"/>
-            <w:tcBorders>
-              <w:top w:val="single" w:sz="4" w:space="0" w:color="auto"/>
-              <w:left w:val="single" w:sz="4" w:space="0" w:color="auto"/>
-              <w:bottom w:val="single" w:sz="4" w:space="0" w:color="auto"/>
-              <w:right w:val="single" w:sz="4" w:space="0" w:color="auto"/>
-            </w:tcBorders>
-          </w:tcPr>
-          <w:p>
-            <w:r>
-              <w:t>39</w:t>
-            </w:r>
-          </w:p>
-        </w:tc>
-        <w:tc>
-          <w:tcPr>
-            <w:tcW w:type="dxa" w:w="1234"/>
-            <w:tcBorders>
-              <w:top w:val="single" w:sz="4" w:space="0" w:color="auto"/>
-              <w:left w:val="single" w:sz="4" w:space="0" w:color="auto"/>
-              <w:bottom w:val="single" w:sz="4" w:space="0" w:color="auto"/>
-              <w:right w:val="single" w:sz="4" w:space="0" w:color="auto"/>
-            </w:tcBorders>
-          </w:tcPr>
-          <w:p>
-            <w:r>
-              <w:t>AM</w:t>
-            </w:r>
-          </w:p>
-        </w:tc>
-      </w:tr>
-      <w:tr>
-        <w:tc>
-          <w:tcPr>
-            <w:tcW w:type="dxa" w:w="1234"/>
-            <w:tcBorders>
-              <w:top w:val="single" w:sz="4" w:space="0" w:color="auto"/>
-              <w:left w:val="single" w:sz="4" w:space="0" w:color="auto"/>
-              <w:bottom w:val="single" w:sz="4" w:space="0" w:color="auto"/>
-              <w:right w:val="single" w:sz="4" w:space="0" w:color="auto"/>
-            </w:tcBorders>
-          </w:tcPr>
-          <w:p>
-            <w:r>
-              <w:t>April</w:t>
-            </w:r>
-          </w:p>
-        </w:tc>
-        <w:tc>
-          <w:tcPr>
-            <w:tcW w:type="dxa" w:w="1234"/>
-            <w:tcBorders>
-              <w:top w:val="single" w:sz="4" w:space="0" w:color="auto"/>
-              <w:left w:val="single" w:sz="4" w:space="0" w:color="auto"/>
-              <w:bottom w:val="single" w:sz="4" w:space="0" w:color="auto"/>
-              <w:right w:val="single" w:sz="4" w:space="0" w:color="auto"/>
-            </w:tcBorders>
-          </w:tcPr>
-          <w:p>
-            <w:r>
-              <w:t>14</w:t>
-            </w:r>
-          </w:p>
-        </w:tc>
-        <w:tc>
-          <w:tcPr>
-            <w:tcW w:type="dxa" w:w="1234"/>
-            <w:tcBorders>
-              <w:top w:val="single" w:sz="4" w:space="0" w:color="auto"/>
-              <w:left w:val="single" w:sz="4" w:space="0" w:color="auto"/>
-              <w:bottom w:val="single" w:sz="4" w:space="0" w:color="auto"/>
-              <w:right w:val="single" w:sz="4" w:space="0" w:color="auto"/>
-            </w:tcBorders>
-          </w:tcPr>
-          <w:p>
-            <w:r>
-              <w:t>2024</w:t>
-            </w:r>
-          </w:p>
-        </w:tc>
-        <w:tc>
-          <w:tcPr>
-            <w:tcW w:type="dxa" w:w="1234"/>
-            <w:tcBorders>
-              <w:top w:val="single" w:sz="4" w:space="0" w:color="auto"/>
-              <w:left w:val="single" w:sz="4" w:space="0" w:color="auto"/>
-              <w:bottom w:val="single" w:sz="4" w:space="0" w:color="auto"/>
-              <w:right w:val="single" w:sz="4" w:space="0" w:color="auto"/>
-            </w:tcBorders>
-          </w:tcPr>
-          <w:p>
-            <w:r>
-              <w:t>06</w:t>
-            </w:r>
-          </w:p>
-        </w:tc>
-        <w:tc>
-          <w:tcPr>
-            <w:tcW w:type="dxa" w:w="1234"/>
-            <w:tcBorders>
-              <w:top w:val="single" w:sz="4" w:space="0" w:color="auto"/>
-              <w:left w:val="single" w:sz="4" w:space="0" w:color="auto"/>
-              <w:bottom w:val="single" w:sz="4" w:space="0" w:color="auto"/>
-              <w:right w:val="single" w:sz="4" w:space="0" w:color="auto"/>
-            </w:tcBorders>
-          </w:tcPr>
-          <w:p>
-            <w:r>
-              <w:t>34</w:t>
-            </w:r>
-          </w:p>
-        </w:tc>
-        <w:tc>
-          <w:tcPr>
-            <w:tcW w:type="dxa" w:w="1234"/>
-            <w:tcBorders>
-              <w:top w:val="single" w:sz="4" w:space="0" w:color="auto"/>
-              <w:left w:val="single" w:sz="4" w:space="0" w:color="auto"/>
-              <w:bottom w:val="single" w:sz="4" w:space="0" w:color="auto"/>
-              <w:right w:val="single" w:sz="4" w:space="0" w:color="auto"/>
-            </w:tcBorders>
-          </w:tcPr>
-          <w:p>
-            <w:r>
-              <w:t>46</w:t>
-            </w:r>
-          </w:p>
-        </w:tc>
-        <w:tc>
-          <w:tcPr>
-            <w:tcW w:type="dxa" w:w="1234"/>
-            <w:tcBorders>
-              <w:top w:val="single" w:sz="4" w:space="0" w:color="auto"/>
-              <w:left w:val="single" w:sz="4" w:space="0" w:color="auto"/>
-              <w:bottom w:val="single" w:sz="4" w:space="0" w:color="auto"/>
-              <w:right w:val="single" w:sz="4" w:space="0" w:color="auto"/>
-            </w:tcBorders>
-          </w:tcPr>
-          <w:p>
-            <w:r>
-              <w:t>AM</w:t>
-            </w:r>
-          </w:p>
-        </w:tc>
-      </w:tr>
-      <w:tr>
-        <w:tc>
-          <w:tcPr>
-            <w:tcW w:type="dxa" w:w="1234"/>
-            <w:tcBorders>
-              <w:top w:val="single" w:sz="4" w:space="0" w:color="auto"/>
-              <w:left w:val="single" w:sz="4" w:space="0" w:color="auto"/>
-              <w:bottom w:val="single" w:sz="4" w:space="0" w:color="auto"/>
-              <w:right w:val="single" w:sz="4" w:space="0" w:color="auto"/>
-            </w:tcBorders>
-          </w:tcPr>
-          <w:p>
-            <w:r>
-              <w:t>May</w:t>
-            </w:r>
-          </w:p>
-        </w:tc>
-        <w:tc>
-          <w:tcPr>
-            <w:tcW w:type="dxa" w:w="1234"/>
-            <w:tcBorders>
-              <w:top w:val="single" w:sz="4" w:space="0" w:color="auto"/>
-              <w:left w:val="single" w:sz="4" w:space="0" w:color="auto"/>
-              <w:bottom w:val="single" w:sz="4" w:space="0" w:color="auto"/>
-              <w:right w:val="single" w:sz="4" w:space="0" w:color="auto"/>
-            </w:tcBorders>
-          </w:tcPr>
-          <w:p>
-            <w:r>
-              <w:t>14</w:t>
-            </w:r>
-          </w:p>
-        </w:tc>
-        <w:tc>
-          <w:tcPr>
-            <w:tcW w:type="dxa" w:w="1234"/>
-            <w:tcBorders>
-              <w:top w:val="single" w:sz="4" w:space="0" w:color="auto"/>
-              <w:left w:val="single" w:sz="4" w:space="0" w:color="auto"/>
-              <w:bottom w:val="single" w:sz="4" w:space="0" w:color="auto"/>
-              <w:right w:val="single" w:sz="4" w:space="0" w:color="auto"/>
-            </w:tcBorders>
-          </w:tcPr>
-          <w:p>
-            <w:r>
-              <w:t>2024</w:t>
-            </w:r>
-          </w:p>
-        </w:tc>
-        <w:tc>
-          <w:tcPr>
-            <w:tcW w:type="dxa" w:w="1234"/>
-            <w:tcBorders>
-              <w:top w:val="single" w:sz="4" w:space="0" w:color="auto"/>
-              <w:left w:val="single" w:sz="4" w:space="0" w:color="auto"/>
-              <w:bottom w:val="single" w:sz="4" w:space="0" w:color="auto"/>
-              <w:right w:val="single" w:sz="4" w:space="0" w:color="auto"/>
-            </w:tcBorders>
-          </w:tcPr>
-          <w:p>
-            <w:r>
-              <w:t>08</w:t>
-            </w:r>
-          </w:p>
-        </w:tc>
-        <w:tc>
-          <w:tcPr>
-            <w:tcW w:type="dxa" w:w="1234"/>
-            <w:tcBorders>
-              <w:top w:val="single" w:sz="4" w:space="0" w:color="auto"/>
-              <w:left w:val="single" w:sz="4" w:space="0" w:color="auto"/>
-              <w:bottom w:val="single" w:sz="4" w:space="0" w:color="auto"/>
-              <w:right w:val="single" w:sz="4" w:space="0" w:color="auto"/>
-            </w:tcBorders>
-          </w:tcPr>
-          <w:p>
-            <w:r>
-              <w:t>13</w:t>
-            </w:r>
-          </w:p>
-        </w:tc>
-        <w:tc>
-          <w:tcPr>
-            <w:tcW w:type="dxa" w:w="1234"/>
-            <w:tcBorders>
-              <w:top w:val="single" w:sz="4" w:space="0" w:color="auto"/>
-              <w:left w:val="single" w:sz="4" w:space="0" w:color="auto"/>
-              <w:bottom w:val="single" w:sz="4" w:space="0" w:color="auto"/>
-              <w:right w:val="single" w:sz="4" w:space="0" w:color="auto"/>
-            </w:tcBorders>
-          </w:tcPr>
-          <w:p>
-            <w:r>
-              <w:t>19</w:t>
-            </w:r>
-          </w:p>
-        </w:tc>
-        <w:tc>
-          <w:tcPr>
-            <w:tcW w:type="dxa" w:w="1234"/>
-            <w:tcBorders>
-              <w:top w:val="single" w:sz="4" w:space="0" w:color="auto"/>
-              <w:left w:val="single" w:sz="4" w:space="0" w:color="auto"/>
-              <w:bottom w:val="single" w:sz="4" w:space="0" w:color="auto"/>
-              <w:right w:val="single" w:sz="4" w:space="0" w:color="auto"/>
-            </w:tcBorders>
-          </w:tcPr>
-          <w:p>
-            <w:r>
-              <w:t>AM</w:t>
-            </w:r>
-          </w:p>
-        </w:tc>
-      </w:tr>
-      <w:tr>
-        <w:tc>
-          <w:tcPr>
-            <w:tcW w:type="dxa" w:w="1234"/>
-            <w:tcBorders>
-              <w:top w:val="single" w:sz="4" w:space="0" w:color="auto"/>
-              <w:left w:val="single" w:sz="4" w:space="0" w:color="auto"/>
-              <w:bottom w:val="single" w:sz="4" w:space="0" w:color="auto"/>
-              <w:right w:val="single" w:sz="4" w:space="0" w:color="auto"/>
-            </w:tcBorders>
-          </w:tcPr>
-          <w:p>
-            <w:r>
-              <w:t>June</w:t>
-            </w:r>
-          </w:p>
-        </w:tc>
-        <w:tc>
-          <w:tcPr>
-            <w:tcW w:type="dxa" w:w="1234"/>
-            <w:tcBorders>
-              <w:top w:val="single" w:sz="4" w:space="0" w:color="auto"/>
-              <w:left w:val="single" w:sz="4" w:space="0" w:color="auto"/>
-              <w:bottom w:val="single" w:sz="4" w:space="0" w:color="auto"/>
-              <w:right w:val="single" w:sz="4" w:space="0" w:color="auto"/>
-            </w:tcBorders>
-          </w:tcPr>
-          <w:p>
-            <w:r>
-              <w:t>13</w:t>
-            </w:r>
-          </w:p>
-        </w:tc>
-        <w:tc>
-          <w:tcPr>
-            <w:tcW w:type="dxa" w:w="1234"/>
-            <w:tcBorders>
-              <w:top w:val="single" w:sz="4" w:space="0" w:color="auto"/>
-              <w:left w:val="single" w:sz="4" w:space="0" w:color="auto"/>
-              <w:bottom w:val="single" w:sz="4" w:space="0" w:color="auto"/>
-              <w:right w:val="single" w:sz="4" w:space="0" w:color="auto"/>
-            </w:tcBorders>
-          </w:tcPr>
-          <w:p>
-            <w:r>
-              <w:t>2024</w:t>
-            </w:r>
-          </w:p>
-        </w:tc>
-        <w:tc>
-          <w:tcPr>
-            <w:tcW w:type="dxa" w:w="1234"/>
-            <w:tcBorders>
-              <w:top w:val="single" w:sz="4" w:space="0" w:color="auto"/>
-              <w:left w:val="single" w:sz="4" w:space="0" w:color="auto"/>
-              <w:bottom w:val="single" w:sz="4" w:space="0" w:color="auto"/>
-              <w:right w:val="single" w:sz="4" w:space="0" w:color="auto"/>
-            </w:tcBorders>
-          </w:tcPr>
-          <w:p>
-            <w:r>
-              <w:t>06</w:t>
-            </w:r>
-          </w:p>
-        </w:tc>
-        <w:tc>
-          <w:tcPr>
-            <w:tcW w:type="dxa" w:w="1234"/>
-            <w:tcBorders>
-              <w:top w:val="single" w:sz="4" w:space="0" w:color="auto"/>
-              <w:left w:val="single" w:sz="4" w:space="0" w:color="auto"/>
-              <w:bottom w:val="single" w:sz="4" w:space="0" w:color="auto"/>
-              <w:right w:val="single" w:sz="4" w:space="0" w:color="auto"/>
-            </w:tcBorders>
-          </w:tcPr>
-          <w:p>
-            <w:r>
-              <w:t>36</w:t>
-            </w:r>
-          </w:p>
-        </w:tc>
-        <w:tc>
-          <w:tcPr>
-            <w:tcW w:type="dxa" w:w="1234"/>
-            <w:tcBorders>
-              <w:top w:val="single" w:sz="4" w:space="0" w:color="auto"/>
-              <w:left w:val="single" w:sz="4" w:space="0" w:color="auto"/>
-              <w:bottom w:val="single" w:sz="4" w:space="0" w:color="auto"/>
-              <w:right w:val="single" w:sz="4" w:space="0" w:color="auto"/>
-            </w:tcBorders>
-          </w:tcPr>
-          <w:p>
-            <w:r>
-              <w:t>10</w:t>
-            </w:r>
-          </w:p>
-        </w:tc>
-        <w:tc>
-          <w:tcPr>
-            <w:tcW w:type="dxa" w:w="1234"/>
-            <w:tcBorders>
-              <w:top w:val="single" w:sz="4" w:space="0" w:color="auto"/>
-              <w:left w:val="single" w:sz="4" w:space="0" w:color="auto"/>
-              <w:bottom w:val="single" w:sz="4" w:space="0" w:color="auto"/>
-              <w:right w:val="single" w:sz="4" w:space="0" w:color="auto"/>
-            </w:tcBorders>
-          </w:tcPr>
-          <w:p>
-            <w:r>
-              <w:t>AM</w:t>
+              <w:t>06:36:10 AM</w:t>
             </w:r>
           </w:p>
         </w:tc>

</xml_diff>

<commit_message>
change font for title and headingd
</commit_message>
<xml_diff>
--- a/detailed_analysis_report.docx
+++ b/detailed_analysis_report.docx
@@ -43,6 +43,9 @@
         <w:pStyle w:val="Title"/>
       </w:pPr>
       <w:r>
+        <w:rPr>
+          <w:color w:val="161747"/>
+        </w:rPr>
         <w:t>Detailed Snapshot Analysis for hamzasiyam.com</w:t>
       </w:r>
     </w:p>
@@ -51,6 +54,9 @@
         <w:pStyle w:val="Heading1"/>
       </w:pPr>
       <w:r>
+        <w:rPr>
+          <w:color w:val="161747"/>
+        </w:rPr>
         <w:t>Introduction</w:t>
       </w:r>
     </w:p>
@@ -64,6 +70,9 @@
         <w:pStyle w:val="Heading1"/>
       </w:pPr>
       <w:r>
+        <w:rPr>
+          <w:color w:val="161747"/>
+        </w:rPr>
         <w:t>Detailed Analysis</w:t>
       </w:r>
     </w:p>
@@ -1508,6 +1517,9 @@
         <w:pStyle w:val="Heading1"/>
       </w:pPr>
       <w:r>
+        <w:rPr>
+          <w:color w:val="161747"/>
+        </w:rPr>
         <w:t>Next Steps</w:t>
       </w:r>
     </w:p>

</xml_diff>